<commit_message>
update user journey files
</commit_message>
<xml_diff>
--- a/My User Journey/User-Journey.docx
+++ b/My User Journey/User-Journey.docx
@@ -4,7 +4,7 @@
   <w:body>
     <w:p>
       <w:pPr>
-        <w:pStyle w:val="139"/>
+        <w:pStyle w:val="844"/>
         <w:pBdr/>
         <w:spacing/>
         <w:ind/>
@@ -64,10 +64,60 @@
           <w:lang w:val="en-GB"/>
         </w:rPr>
       </w:r>
+      <w:r>
+        <w:rPr>
+          <w:rFonts w:ascii="Times" w:hAnsi="Times" w:cs="Times"/>
+          <w:b/>
+          <w:bCs/>
+          <w:color w:val="000000" w:themeColor="text1"/>
+          <w:sz w:val="44"/>
+          <w:szCs w:val="44"/>
+        </w:rPr>
+      </w:r>
     </w:p>
     <w:p>
       <w:pPr>
-        <w:pStyle w:val="140"/>
+        <w:pBdr/>
+        <w:spacing/>
+        <w:ind/>
+        <w:rPr>
+          <w:rFonts w:ascii="Times" w:hAnsi="Times" w:cs="Times"/>
+          <w:b w:val="0"/>
+          <w:bCs w:val="0"/>
+          <w:sz w:val="16"/>
+          <w:szCs w:val="16"/>
+          <w14:ligatures w14:val="none"/>
+        </w:rPr>
+      </w:pPr>
+      <w:r>
+        <w:rPr>
+          <w:rFonts w:ascii="Times" w:hAnsi="Times" w:eastAsia="Times" w:cs="Times"/>
+          <w:highlight w:val="none"/>
+          <w:lang w:val="en-US"/>
+        </w:rPr>
+        <w:t xml:space="preserve">No</w:t>
+      </w:r>
+      <w:r>
+        <w:rPr>
+          <w:rFonts w:ascii="Times" w:hAnsi="Times" w:eastAsia="Times" w:cs="Times"/>
+          <w:highlight w:val="none"/>
+          <w:lang w:val="en-US"/>
+        </w:rPr>
+        <w:t xml:space="preserve">te: This is restructured by AI from my original user journey.</w:t>
+      </w:r>
+      <w:r>
+        <w:rPr>
+          <w:rFonts w:ascii="Times" w:hAnsi="Times" w:eastAsia="Times" w:cs="Times"/>
+          <w:b w:val="0"/>
+          <w:bCs w:val="0"/>
+          <w:sz w:val="16"/>
+          <w:szCs w:val="16"/>
+        </w:rPr>
+      </w:r>
+    </w:p>
+    <w:p>
+      <w:pPr>
+        <w:pStyle w:val="845"/>
         <w:pBdr>
           <w:top w:val="none" w:color="000000" w:sz="4" w:space="0"/>
           <w:left w:val="none" w:color="000000" w:sz="4" w:space="0"/>
@@ -77,7 +127,14 @@
         <w:spacing/>
         <w:ind w:right="0" w:firstLine="0" w:left="0"/>
         <w:rPr>
-          <w:rFonts w:ascii="Times" w:hAnsi="Times" w:cs="Times"/>
+          <w:rFonts w:ascii="Times" w:hAnsi="Times" w:eastAsia="Times" w:cs="Times"/>
+          <w:b/>
+          <w:bCs/>
+          <w:color w:val="000000"/>
+          <w:sz w:val="36"/>
+          <w:szCs w:val="36"/>
+          <w:highlight w:val="none"/>
+          <w:lang w:val="en-GB"/>
         </w:rPr>
       </w:pPr>
       <w:r>
@@ -96,10 +153,15 @@
           <w:lang w:val="en-GB"/>
         </w:rPr>
       </w:r>
+      <w:r>
+        <w:rPr>
+          <w:rFonts w:ascii="Times" w:hAnsi="Times" w:cs="Times"/>
+        </w:rPr>
+      </w:r>
     </w:p>
     <w:p>
       <w:pPr>
-        <w:pStyle w:val="668"/>
+        <w:pStyle w:val="907"/>
         <w:numPr>
           <w:ilvl w:val="0"/>
           <w:numId w:val="1"/>
@@ -216,10 +278,15 @@
           <w:lang w:val="en-GB"/>
         </w:rPr>
       </w:r>
+      <w:r>
+        <w:rPr>
+          <w:rFonts w:ascii="Times" w:hAnsi="Times" w:cs="Times"/>
+        </w:rPr>
+      </w:r>
     </w:p>
     <w:p>
       <w:pPr>
-        <w:pStyle w:val="668"/>
+        <w:pStyle w:val="907"/>
         <w:numPr>
           <w:ilvl w:val="0"/>
           <w:numId w:val="1"/>
@@ -279,10 +346,15 @@
           <w:lang w:val="en-GB"/>
         </w:rPr>
       </w:r>
+      <w:r>
+        <w:rPr>
+          <w:rFonts w:ascii="Times" w:hAnsi="Times" w:cs="Times"/>
+        </w:rPr>
+      </w:r>
     </w:p>
     <w:p>
       <w:pPr>
-        <w:pStyle w:val="668"/>
+        <w:pStyle w:val="907"/>
         <w:numPr>
           <w:ilvl w:val="0"/>
           <w:numId w:val="1"/>
@@ -324,10 +396,15 @@
           <w:lang w:val="en-GB"/>
         </w:rPr>
       </w:r>
+      <w:r>
+        <w:rPr>
+          <w:rFonts w:ascii="Times" w:hAnsi="Times" w:cs="Times"/>
+        </w:rPr>
+      </w:r>
     </w:p>
     <w:p>
       <w:pPr>
-        <w:pStyle w:val="140"/>
+        <w:pStyle w:val="845"/>
         <w:pBdr>
           <w:top w:val="none" w:color="000000" w:sz="4" w:space="0"/>
           <w:left w:val="none" w:color="000000" w:sz="4" w:space="0"/>
@@ -356,10 +433,15 @@
           <w:lang w:val="en-GB"/>
         </w:rPr>
       </w:r>
+      <w:r>
+        <w:rPr>
+          <w:rFonts w:ascii="Times" w:hAnsi="Times" w:cs="Times"/>
+        </w:rPr>
+      </w:r>
     </w:p>
     <w:p>
       <w:pPr>
-        <w:pStyle w:val="668"/>
+        <w:pStyle w:val="907"/>
         <w:numPr>
           <w:ilvl w:val="0"/>
           <w:numId w:val="1"/>
@@ -437,10 +519,15 @@
           <w:lang w:val="en-GB"/>
         </w:rPr>
       </w:r>
+      <w:r>
+        <w:rPr>
+          <w:rFonts w:ascii="Times" w:hAnsi="Times" w:cs="Times"/>
+        </w:rPr>
+      </w:r>
     </w:p>
     <w:p>
       <w:pPr>
-        <w:pStyle w:val="668"/>
+        <w:pStyle w:val="907"/>
         <w:numPr>
           <w:ilvl w:val="0"/>
           <w:numId w:val="1"/>
@@ -482,10 +569,15 @@
           <w:lang w:val="en-GB"/>
         </w:rPr>
       </w:r>
+      <w:r>
+        <w:rPr>
+          <w:rFonts w:ascii="Times" w:hAnsi="Times" w:cs="Times"/>
+        </w:rPr>
+      </w:r>
     </w:p>
     <w:p>
       <w:pPr>
-        <w:pStyle w:val="668"/>
+        <w:pStyle w:val="907"/>
         <w:numPr>
           <w:ilvl w:val="0"/>
           <w:numId w:val="1"/>
@@ -621,10 +713,15 @@
           <w:lang w:val="en-GB"/>
         </w:rPr>
       </w:r>
+      <w:r>
+        <w:rPr>
+          <w:rFonts w:ascii="Times" w:hAnsi="Times" w:cs="Times"/>
+        </w:rPr>
+      </w:r>
     </w:p>
     <w:p>
       <w:pPr>
-        <w:pStyle w:val="668"/>
+        <w:pStyle w:val="907"/>
         <w:numPr>
           <w:ilvl w:val="0"/>
           <w:numId w:val="1"/>
@@ -673,10 +770,17 @@
           <w:lang w:val="en-GB"/>
         </w:rPr>
       </w:r>
+      <w:r>
+        <w:rPr>
+          <w:rFonts w:ascii="Times" w:hAnsi="Times" w:cs="Times"/>
+          <w:sz w:val="24"/>
+          <w:szCs w:val="24"/>
+        </w:rPr>
+      </w:r>
     </w:p>
     <w:p>
       <w:pPr>
-        <w:pStyle w:val="668"/>
+        <w:pStyle w:val="907"/>
         <w:numPr>
           <w:ilvl w:val="0"/>
           <w:numId w:val="1"/>
@@ -744,24 +848,22 @@
       <w:r>
         <w:rPr>
           <w:rFonts w:ascii="Times" w:hAnsi="Times" w:eastAsia="Times" w:cs="Times"/>
-          <w:color w:val="000000"/>
-          <w:sz w:val="24"/>
-          <w:highlight w:val="none"/>
-          <w:lang w:val="en-GB" w:bidi="en-GB"/>
-        </w:rPr>
-      </w:r>
-      <w:r>
-        <w:rPr>
-          <w:rFonts w:ascii="Times" w:hAnsi="Times" w:eastAsia="Times" w:cs="Times"/>
           <w:sz w:val="24"/>
           <w:szCs w:val="24"/>
           <w:lang w:val="en-GB"/>
         </w:rPr>
       </w:r>
+      <w:r>
+        <w:rPr>
+          <w:rFonts w:ascii="Times" w:hAnsi="Times" w:cs="Times"/>
+          <w:sz w:val="24"/>
+          <w:szCs w:val="24"/>
+        </w:rPr>
+      </w:r>
     </w:p>
     <w:p>
       <w:pPr>
-        <w:pStyle w:val="668"/>
+        <w:pStyle w:val="907"/>
         <w:numPr>
           <w:ilvl w:val="0"/>
           <w:numId w:val="1"/>
@@ -835,7 +937,17 @@
           <w:highlight w:val="none"/>
           <w:lang w:val="en-US"/>
         </w:rPr>
-        <w:t xml:space="preserve">The framework’s documentation is both accessible and exhaustive, eliminating implementation guesswork through dedicated tutorials for every feature and a comprehensive API reference. The onboarding process feels entirely natural, anchored by a high-impact "</w:t>
+        <w:t xml:space="preserve">T</w:t>
+      </w:r>
+      <w:r>
+        <w:rPr>
+          <w:rFonts w:ascii="Times" w:hAnsi="Times" w:eastAsia="Times" w:cs="Times"/>
+          <w:color w:val="000000"/>
+          <w:sz w:val="24"/>
+          <w:highlight w:val="none"/>
+          <w:lang w:val="en-US"/>
+        </w:rPr>
+        <w:t xml:space="preserve">he framework’s documentation is both accessible and exhaustive, eliminating implementation guesswork through dedicated tutorials for every feature and a comprehensive API reference. The onboarding process feels entirely natural, anchored by a high-impact "</w:t>
       </w:r>
       <w:r>
         <w:rPr>
@@ -872,24 +984,24 @@
           <w:rFonts w:ascii="Times" w:hAnsi="Times" w:eastAsia="Times" w:cs="Times"/>
           <w:color w:val="000000"/>
           <w:sz w:val="24"/>
+          <w:szCs w:val="24"/>
           <w:highlight w:val="none"/>
           <w:lang w:val="en-US"/>
         </w:rPr>
       </w:r>
       <w:r>
         <w:rPr>
-          <w:rFonts w:ascii="Times" w:hAnsi="Times" w:eastAsia="Times" w:cs="Times"/>
+          <w:rFonts w:ascii="Times" w:hAnsi="Times" w:cs="Times"/>
           <w:color w:val="000000"/>
           <w:sz w:val="24"/>
           <w:szCs w:val="24"/>
           <w:highlight w:val="none"/>
-          <w:lang w:val="en-US"/>
         </w:rPr>
       </w:r>
     </w:p>
     <w:p>
       <w:pPr>
-        <w:pStyle w:val="140"/>
+        <w:pStyle w:val="845"/>
         <w:pBdr>
           <w:top w:val="none" w:color="000000" w:sz="4" w:space="0"/>
           <w:left w:val="none" w:color="000000" w:sz="4" w:space="0"/>
@@ -918,10 +1030,15 @@
           <w:lang w:val="en-GB"/>
         </w:rPr>
       </w:r>
+      <w:r>
+        <w:rPr>
+          <w:rFonts w:ascii="Times" w:hAnsi="Times" w:cs="Times"/>
+        </w:rPr>
+      </w:r>
     </w:p>
     <w:p>
       <w:pPr>
-        <w:pStyle w:val="668"/>
+        <w:pStyle w:val="907"/>
         <w:numPr>
           <w:ilvl w:val="0"/>
           <w:numId w:val="1"/>
@@ -978,22 +1095,19 @@
       <w:r>
         <w:rPr>
           <w:rFonts w:ascii="Times" w:hAnsi="Times" w:eastAsia="Times" w:cs="Times"/>
-          <w:color w:val="000000"/>
           <w:sz w:val="24"/>
-          <w:lang w:val="en-GB" w:bidi="en-GB"/>
+          <w:lang w:val="en-GB"/>
         </w:rPr>
       </w:r>
       <w:r>
         <w:rPr>
-          <w:rFonts w:ascii="Times" w:hAnsi="Times" w:eastAsia="Times" w:cs="Times"/>
-          <w:sz w:val="24"/>
-          <w:lang w:val="en-GB"/>
+          <w:rFonts w:ascii="Times" w:hAnsi="Times" w:cs="Times"/>
         </w:rPr>
       </w:r>
     </w:p>
     <w:p>
       <w:pPr>
-        <w:pStyle w:val="668"/>
+        <w:pStyle w:val="907"/>
         <w:numPr>
           <w:ilvl w:val="0"/>
           <w:numId w:val="1"/>
@@ -1079,24 +1193,22 @@
       <w:r>
         <w:rPr>
           <w:rFonts w:ascii="Times" w:hAnsi="Times" w:eastAsia="Times" w:cs="Times"/>
-          <w:color w:val="000000"/>
-          <w:sz w:val="24"/>
-          <w:highlight w:val="none"/>
-          <w:lang w:val="en-GB" w:bidi="en-GB"/>
-        </w:rPr>
-      </w:r>
-      <w:r>
-        <w:rPr>
-          <w:rFonts w:ascii="Times" w:hAnsi="Times" w:eastAsia="Times" w:cs="Times"/>
           <w:sz w:val="24"/>
           <w:szCs w:val="24"/>
           <w:lang w:val="en-GB"/>
         </w:rPr>
       </w:r>
+      <w:r>
+        <w:rPr>
+          <w:rFonts w:ascii="Times" w:hAnsi="Times" w:cs="Times"/>
+          <w:sz w:val="24"/>
+          <w:szCs w:val="24"/>
+        </w:rPr>
+      </w:r>
     </w:p>
     <w:p>
       <w:pPr>
-        <w:pStyle w:val="668"/>
+        <w:pStyle w:val="907"/>
         <w:numPr>
           <w:ilvl w:val="0"/>
           <w:numId w:val="1"/>
@@ -1174,17 +1286,15 @@
       </w:r>
       <w:r>
         <w:rPr>
-          <w:rFonts w:ascii="Times" w:hAnsi="Times" w:eastAsia="Times" w:cs="Times"/>
-          <w:color w:val="000000"/>
+          <w:rFonts w:ascii="Times" w:hAnsi="Times" w:cs="Times"/>
           <w:sz w:val="24"/>
-          <w:highlight w:val="none"/>
-          <w:lang w:val="en-GB" w:bidi="en-GB"/>
+          <w:szCs w:val="24"/>
         </w:rPr>
       </w:r>
     </w:p>
     <w:p>
       <w:pPr>
-        <w:pStyle w:val="668"/>
+        <w:pStyle w:val="907"/>
         <w:numPr>
           <w:ilvl w:val="0"/>
           <w:numId w:val="1"/>
@@ -1255,22 +1365,20 @@
           <w:color w:val="000000"/>
           <w:sz w:val="24"/>
           <w:highlight w:val="none"/>
-          <w:lang w:val="en-GB" w:bidi="en-GB"/>
+          <w:lang w:val="en-GB"/>
         </w:rPr>
       </w:r>
       <w:r>
         <w:rPr>
-          <w:rFonts w:ascii="Times" w:hAnsi="Times" w:eastAsia="Times" w:cs="Times"/>
-          <w:color w:val="000000"/>
+          <w:rFonts w:ascii="Times" w:hAnsi="Times" w:cs="Times"/>
           <w:sz w:val="24"/>
-          <w:highlight w:val="none"/>
-          <w:lang w:val="en-GB"/>
+          <w:szCs w:val="24"/>
         </w:rPr>
       </w:r>
     </w:p>
     <w:p>
       <w:pPr>
-        <w:pStyle w:val="668"/>
+        <w:pStyle w:val="907"/>
         <w:numPr>
           <w:ilvl w:val="0"/>
           <w:numId w:val="1"/>
@@ -1341,10 +1449,15 @@
           <w:lang w:val="en-GB"/>
         </w:rPr>
       </w:r>
+      <w:r>
+        <w:rPr>
+          <w:rFonts w:ascii="Times" w:hAnsi="Times" w:cs="Times"/>
+        </w:rPr>
+      </w:r>
     </w:p>
     <w:p>
       <w:pPr>
-        <w:pStyle w:val="668"/>
+        <w:pStyle w:val="907"/>
         <w:numPr>
           <w:ilvl w:val="0"/>
           <w:numId w:val="1"/>
@@ -1486,23 +1599,19 @@
       <w:r>
         <w:rPr>
           <w:rFonts w:ascii="Times" w:hAnsi="Times" w:eastAsia="Times" w:cs="Times"/>
-          <w:color w:val="000000"/>
           <w:sz w:val="24"/>
-          <w:highlight w:val="none"/>
-          <w:lang w:val="en-GB" w:bidi="en-GB"/>
+          <w:lang w:val="en-GB"/>
         </w:rPr>
       </w:r>
       <w:r>
         <w:rPr>
-          <w:rFonts w:ascii="Times" w:hAnsi="Times" w:eastAsia="Times" w:cs="Times"/>
-          <w:sz w:val="24"/>
-          <w:lang w:val="en-GB"/>
+          <w:rFonts w:ascii="Times" w:hAnsi="Times" w:cs="Times"/>
         </w:rPr>
       </w:r>
     </w:p>
     <w:p>
       <w:pPr>
-        <w:pStyle w:val="140"/>
+        <w:pStyle w:val="845"/>
         <w:pBdr>
           <w:top w:val="none" w:color="000000" w:sz="4" w:space="0"/>
           <w:left w:val="none" w:color="000000" w:sz="4" w:space="0"/>
@@ -1571,10 +1680,15 @@
           <w:lang w:val="en-GB"/>
         </w:rPr>
       </w:r>
+      <w:r>
+        <w:rPr>
+          <w:rFonts w:ascii="Times" w:hAnsi="Times" w:cs="Times"/>
+        </w:rPr>
+      </w:r>
     </w:p>
     <w:p>
       <w:pPr>
-        <w:pStyle w:val="668"/>
+        <w:pStyle w:val="907"/>
         <w:numPr>
           <w:ilvl w:val="0"/>
           <w:numId w:val="1"/>
@@ -1616,10 +1730,15 @@
           <w:lang w:val="en-GB"/>
         </w:rPr>
       </w:r>
+      <w:r>
+        <w:rPr>
+          <w:rFonts w:ascii="Times" w:hAnsi="Times" w:cs="Times"/>
+        </w:rPr>
+      </w:r>
     </w:p>
     <w:p>
       <w:pPr>
-        <w:pStyle w:val="668"/>
+        <w:pStyle w:val="907"/>
         <w:numPr>
           <w:ilvl w:val="0"/>
           <w:numId w:val="1"/>
@@ -1706,10 +1825,15 @@
           <w:lang w:val="en-GB"/>
         </w:rPr>
       </w:r>
+      <w:r>
+        <w:rPr>
+          <w:rFonts w:ascii="Times" w:hAnsi="Times" w:cs="Times"/>
+        </w:rPr>
+      </w:r>
     </w:p>
     <w:p>
       <w:pPr>
-        <w:pStyle w:val="668"/>
+        <w:pStyle w:val="907"/>
         <w:numPr>
           <w:ilvl w:val="0"/>
           <w:numId w:val="1"/>
@@ -1761,10 +1885,15 @@
           <w:lang w:val="en-GB"/>
         </w:rPr>
       </w:r>
+      <w:r>
+        <w:rPr>
+          <w:rFonts w:ascii="Times" w:hAnsi="Times" w:cs="Times"/>
+        </w:rPr>
+      </w:r>
     </w:p>
     <w:p>
       <w:pPr>
-        <w:pStyle w:val="668"/>
+        <w:pStyle w:val="907"/>
         <w:numPr>
           <w:ilvl w:val="0"/>
           <w:numId w:val="1"/>
@@ -1803,7 +1932,17 @@
           <w:highlight w:val="none"/>
           <w:lang w:val="en-GB"/>
         </w:rPr>
-        <w:t xml:space="preserve">: I visualise the entire list of agents, beautifully structured like a file tree. I see how many agents are in my system with the hierarchy. I see which agent has failed to run the step. It has an easily navigable error debugger. I set default behaviours to the my agents when they fail. I also see delete and add agen</w:t>
+        <w:t xml:space="preserve">: I visualise the entire list of agents, beautifully structure</w:t>
+      </w:r>
+      <w:r>
+        <w:rPr>
+          <w:rFonts w:ascii="Times" w:hAnsi="Times" w:eastAsia="Times" w:cs="Times"/>
+          <w:color w:val="000000"/>
+          <w:sz w:val="24"/>
+          <w:highlight w:val="none"/>
+          <w:lang w:val="en-GB"/>
+        </w:rPr>
+        <w:t xml:space="preserve">d like a file tree. I see how many agents are in my system with the hierarchy. I see which agent has failed to run the step. It has an easily navigable error debugger. I set default behaviours to the my agents when they fail. I also see delete and add agen</w:t>
       </w:r>
       <w:r>
         <w:rPr>
@@ -1834,10 +1973,17 @@
           <w:lang w:val="en-GB"/>
         </w:rPr>
       </w:r>
+      <w:r>
+        <w:rPr>
+          <w:rFonts w:ascii="Times" w:hAnsi="Times" w:cs="Times"/>
+          <w:sz w:val="24"/>
+          <w:szCs w:val="24"/>
+        </w:rPr>
+      </w:r>
     </w:p>
     <w:p>
       <w:pPr>
-        <w:pStyle w:val="668"/>
+        <w:pStyle w:val="907"/>
         <w:numPr>
           <w:ilvl w:val="0"/>
           <w:numId w:val="1"/>
@@ -1887,24 +2033,22 @@
       <w:r>
         <w:rPr>
           <w:rFonts w:ascii="Times" w:hAnsi="Times" w:eastAsia="Times" w:cs="Times"/>
-          <w:color w:val="000000"/>
-          <w:sz w:val="24"/>
-          <w:highlight w:val="none"/>
-          <w:lang w:val="en-GB" w:bidi="en-GB"/>
-        </w:rPr>
-      </w:r>
-      <w:r>
-        <w:rPr>
-          <w:rFonts w:ascii="Times" w:hAnsi="Times" w:eastAsia="Times" w:cs="Times"/>
           <w:sz w:val="24"/>
           <w:szCs w:val="24"/>
           <w:lang w:val="en-GB"/>
         </w:rPr>
       </w:r>
+      <w:r>
+        <w:rPr>
+          <w:rFonts w:ascii="Times" w:hAnsi="Times" w:cs="Times"/>
+          <w:sz w:val="24"/>
+          <w:szCs w:val="24"/>
+        </w:rPr>
+      </w:r>
     </w:p>
     <w:p>
       <w:pPr>
-        <w:pStyle w:val="668"/>
+        <w:pStyle w:val="907"/>
         <w:numPr>
           <w:ilvl w:val="0"/>
           <w:numId w:val="1"/>
@@ -1955,7 +2099,19 @@
           <w:highlight w:val="none"/>
           <w:lang w:val="en-GB"/>
         </w:rPr>
-        <w:t xml:space="preserve">The agents have strict rules and work only based on my given system and agent-wise prompts. They don’t go out of boundaries. There actions feel deterministic rather than loose rogue. I don’t have to be very careful and think much how to put the agents ‘on leash’ with my prompts. They just do what I say, </w:t>
+        <w:t xml:space="preserve">The agents have strict rules and work only based </w:t>
+      </w:r>
+      <w:r>
+        <w:rPr>
+          <w:rFonts w:ascii="Times" w:hAnsi="Times" w:eastAsia="Times" w:cs="Times"/>
+          <w:b w:val="0"/>
+          <w:bCs w:val="0"/>
+          <w:color w:val="000000"/>
+          <w:sz w:val="24"/>
+          <w:highlight w:val="none"/>
+          <w:lang w:val="en-GB"/>
+        </w:rPr>
+        <w:t xml:space="preserve">on my given system and agent-wise prompts. They don’t go out of boundaries. There actions feel deterministic rather than loose rogue. I don’t have to be very careful and think much how to put the agents ‘on leash’ with my prompts. They just do what I say, </w:t>
       </w:r>
       <w:r>
         <w:rPr>
@@ -2062,20 +2218,19 @@
       <w:r>
         <w:rPr>
           <w:rFonts w:ascii="Times" w:hAnsi="Times" w:eastAsia="Times" w:cs="Times"/>
-          <w:lang w:val="en-GB" w:bidi="en-GB"/>
+          <w:sz w:val="24"/>
+          <w:lang w:val="en-GB"/>
         </w:rPr>
       </w:r>
       <w:r>
         <w:rPr>
-          <w:rFonts w:ascii="Times" w:hAnsi="Times" w:eastAsia="Times" w:cs="Times"/>
-          <w:sz w:val="24"/>
-          <w:lang w:val="en-GB"/>
+          <w:rFonts w:ascii="Times" w:hAnsi="Times" w:cs="Times"/>
         </w:rPr>
       </w:r>
     </w:p>
     <w:p>
       <w:pPr>
-        <w:pStyle w:val="668"/>
+        <w:pStyle w:val="907"/>
         <w:numPr>
           <w:ilvl w:val="0"/>
           <w:numId w:val="1"/>
@@ -2167,22 +2322,20 @@
           <w:color w:val="000000"/>
           <w:sz w:val="24"/>
           <w:highlight w:val="none"/>
-          <w:lang w:val="en-GB" w:bidi="en-GB"/>
+          <w:lang w:val="en-GB"/>
         </w:rPr>
       </w:r>
       <w:r>
         <w:rPr>
-          <w:rFonts w:ascii="Times" w:hAnsi="Times" w:eastAsia="Times" w:cs="Times"/>
-          <w:color w:val="000000"/>
+          <w:rFonts w:ascii="Times" w:hAnsi="Times" w:cs="Times"/>
           <w:sz w:val="24"/>
-          <w:highlight w:val="none"/>
-          <w:lang w:val="en-GB"/>
+          <w:szCs w:val="24"/>
         </w:rPr>
       </w:r>
     </w:p>
     <w:p>
       <w:pPr>
-        <w:pStyle w:val="668"/>
+        <w:pStyle w:val="907"/>
         <w:numPr>
           <w:ilvl w:val="0"/>
           <w:numId w:val="1"/>
@@ -2239,22 +2392,19 @@
       <w:r>
         <w:rPr>
           <w:rFonts w:ascii="Times" w:hAnsi="Times" w:eastAsia="Times" w:cs="Times"/>
-          <w:color w:val="000000"/>
           <w:sz w:val="24"/>
-          <w:lang w:val="en-GB" w:bidi="en-GB"/>
+          <w:lang w:val="en-GB"/>
         </w:rPr>
       </w:r>
       <w:r>
         <w:rPr>
-          <w:rFonts w:ascii="Times" w:hAnsi="Times" w:eastAsia="Times" w:cs="Times"/>
-          <w:sz w:val="24"/>
-          <w:lang w:val="en-GB"/>
+          <w:rFonts w:ascii="Times" w:hAnsi="Times" w:cs="Times"/>
         </w:rPr>
       </w:r>
     </w:p>
     <w:p>
       <w:pPr>
-        <w:pStyle w:val="668"/>
+        <w:pStyle w:val="907"/>
         <w:numPr>
           <w:ilvl w:val="0"/>
           <w:numId w:val="2"/>
@@ -2306,21 +2456,20 @@
           <w:rFonts w:ascii="Times" w:hAnsi="Times" w:eastAsia="Times" w:cs="Times"/>
           <w:sz w:val="24"/>
           <w:szCs w:val="24"/>
-          <w:lang w:val="en-GB" w:bidi="en-GB"/>
+          <w:lang w:val="en-GB"/>
         </w:rPr>
       </w:r>
       <w:r>
         <w:rPr>
-          <w:rFonts w:ascii="Times" w:hAnsi="Times" w:eastAsia="Times" w:cs="Times"/>
+          <w:rFonts w:ascii="Times" w:hAnsi="Times" w:cs="Times"/>
           <w:sz w:val="24"/>
           <w:szCs w:val="24"/>
-          <w:lang w:val="en-GB"/>
         </w:rPr>
       </w:r>
     </w:p>
     <w:p>
       <w:pPr>
-        <w:pStyle w:val="668"/>
+        <w:pStyle w:val="907"/>
         <w:numPr>
           <w:ilvl w:val="0"/>
           <w:numId w:val="2"/>
@@ -2425,6 +2574,13 @@
           <w:lang w:val="en-GB"/>
         </w:rPr>
       </w:r>
+      <w:r>
+        <w:rPr>
+          <w:rFonts w:ascii="Times" w:hAnsi="Times" w:cs="Times"/>
+          <w:sz w:val="24"/>
+          <w:szCs w:val="24"/>
+        </w:rPr>
+      </w:r>
     </w:p>
     <w:p>
       <w:pPr>
@@ -2442,15 +2598,6 @@
           <w:szCs w:val="24"/>
         </w:rPr>
       </w:pPr>
-      <w:r>
-        <w:rPr>
-          <w:rFonts w:ascii="Times" w:hAnsi="Times" w:eastAsia="Times" w:cs="Times"/>
-          <w:color w:val="000000"/>
-          <w:sz w:val="24"/>
-          <w:highlight w:val="none"/>
-          <w:lang w:val="en-GB" w:bidi="en-GB"/>
-        </w:rPr>
-      </w:r>
       <w:r>
         <w:rPr>
           <w:rFonts w:ascii="Times" w:hAnsi="Times" w:eastAsia="Times" w:cs="Times"/>
@@ -2469,6 +2616,13 @@
           <w:lang w:val="en-GB"/>
         </w:rPr>
       </w:r>
+      <w:r>
+        <w:rPr>
+          <w:rFonts w:ascii="Times" w:hAnsi="Times" w:cs="Times"/>
+          <w:sz w:val="24"/>
+          <w:szCs w:val="24"/>
+        </w:rPr>
+      </w:r>
     </w:p>
     <w:p>
       <w:pPr>
@@ -2479,12 +2633,6 @@
           <w:rFonts w:ascii="Times" w:hAnsi="Times" w:cs="Times"/>
         </w:rPr>
       </w:pPr>
-      <w:r>
-        <w:rPr>
-          <w:rFonts w:ascii="Times" w:hAnsi="Times" w:eastAsia="Times" w:cs="Times"/>
-          <w:lang w:val="en-GB" w:bidi="en-GB"/>
-        </w:rPr>
-      </w:r>
       <w:r>
         <w:rPr>
           <w:rFonts w:ascii="Times" w:hAnsi="Times" w:eastAsia="Times" w:cs="Times"/>
@@ -2495,6 +2643,11 @@
         <w:rPr>
           <w:rFonts w:ascii="Times" w:hAnsi="Times" w:eastAsia="Times" w:cs="Times"/>
           <w:lang w:val="en-GB"/>
+        </w:rPr>
+      </w:r>
+      <w:r>
+        <w:rPr>
+          <w:rFonts w:ascii="Times" w:hAnsi="Times" w:cs="Times"/>
         </w:rPr>
       </w:r>
     </w:p>
@@ -2521,7 +2674,6 @@
         <w:ind/>
         <w:rPr/>
       </w:pPr>
-      <w:r/>
       <w:r>
         <w:separator/>
       </w:r>
@@ -2536,7 +2688,6 @@
         <w:ind/>
         <w:rPr/>
       </w:pPr>
-      <w:r/>
       <w:r>
         <w:continuationSeparator/>
       </w:r>
@@ -2556,7 +2707,6 @@
         <w:ind/>
         <w:rPr/>
       </w:pPr>
-      <w:r/>
       <w:r>
         <w:separator/>
       </w:r>
@@ -2571,7 +2721,6 @@
         <w:ind/>
         <w:rPr/>
       </w:pPr>
-      <w:r/>
       <w:r>
         <w:continuationSeparator/>
       </w:r>
@@ -2585,7 +2734,7 @@
 <w:hdr xmlns:wpc="http://schemas.microsoft.com/office/word/2010/wordprocessingCanvas" xmlns:mc="http://schemas.openxmlformats.org/markup-compatibility/2006" xmlns:o="urn:schemas-microsoft-com:office:office" xmlns:r="http://schemas.openxmlformats.org/officeDocument/2006/relationships" xmlns:m="http://schemas.openxmlformats.org/officeDocument/2006/math" xmlns:v="urn:schemas-microsoft-com:vml" xmlns:wp14="http://schemas.microsoft.com/office/word/2010/wordprocessingDrawing" xmlns:wp="http://schemas.openxmlformats.org/drawingml/2006/wordprocessingDrawing" xmlns:w10="urn:schemas-microsoft-com:office:word" xmlns:w="http://schemas.openxmlformats.org/wordprocessingml/2006/main" xmlns:w14="http://schemas.microsoft.com/office/word/2010/wordml" xmlns:w15="http://schemas.microsoft.com/office/word/2012/wordml" xmlns:wpg="http://schemas.microsoft.com/office/word/2010/wordprocessingGroup" xmlns:wpi="http://schemas.microsoft.com/office/word/2010/wordprocessingInk" xmlns:wne="http://schemas.microsoft.com/office/word/2006/wordml" xmlns:a="http://schemas.openxmlformats.org/drawingml/2006/main" xmlns:wps="http://schemas.microsoft.com/office/word/2010/wordprocessingShape" mc:Ignorable="w14 w15 wp14">
   <w:p>
     <w:pPr>
-      <w:pStyle w:val="176"/>
+      <w:pStyle w:val="878"/>
       <w:pBdr/>
       <w:tabs>
         <w:tab w:val="clear" w:leader="none" w:pos="4844"/>
@@ -2597,7 +2746,6 @@
       <w:jc w:val="right"/>
       <w:rPr/>
     </w:pPr>
-    <w:r/>
     <w:r>
       <w:rPr>
         <w:i/>
@@ -2617,15 +2765,7 @@
         <w:szCs w:val="20"/>
         <w:lang w:val="en-US"/>
       </w:rPr>
-      <w:t xml:space="preserve">Last updated - 15-Mar-2026</w:t>
-    </w:r>
-    <w:r/>
-    <w:r/>
-    <w:r>
-      <w:rPr>
-        <w:sz w:val="24"/>
-        <w:szCs w:val="24"/>
-      </w:rPr>
+      <w:t xml:space="preserve">Last updated - 28-Mar-2026</w:t>
     </w:r>
     <w:r>
       <w:rPr>
@@ -3101,9 +3241,9 @@
     <w:lsdException w:name="Bibliography" w:uiPriority="37"/>
     <w:lsdException w:name="TOC Heading" w:uiPriority="39" w:qFormat="1"/>
   </w:latentStyles>
-  <w:style w:type="table" w:styleId="12">
+  <w:style w:type="table" w:styleId="718">
     <w:name w:val="Table Grid"/>
-    <w:basedOn w:val="665"/>
+    <w:basedOn w:val="904"/>
     <w:uiPriority w:val="59"/>
     <w:pPr>
       <w:pBdr/>
@@ -3300,9 +3440,9 @@
       </w:tcPr>
     </w:tblStylePr>
   </w:style>
-  <w:style w:type="table" w:styleId="13">
+  <w:style w:type="table" w:styleId="719">
     <w:name w:val="Table Grid Light"/>
-    <w:basedOn w:val="665"/>
+    <w:basedOn w:val="904"/>
     <w:uiPriority w:val="59"/>
     <w:pPr>
       <w:pBdr/>
@@ -3499,9 +3639,9 @@
       </w:tcPr>
     </w:tblStylePr>
   </w:style>
-  <w:style w:type="table" w:styleId="14">
+  <w:style w:type="table" w:styleId="720">
     <w:name w:val="Plain Table 1"/>
-    <w:basedOn w:val="665"/>
+    <w:basedOn w:val="904"/>
     <w:uiPriority w:val="59"/>
     <w:pPr>
       <w:pBdr/>
@@ -3724,9 +3864,9 @@
       </w:tcPr>
     </w:tblStylePr>
   </w:style>
-  <w:style w:type="table" w:styleId="15">
+  <w:style w:type="table" w:styleId="721">
     <w:name w:val="Plain Table 2"/>
-    <w:basedOn w:val="665"/>
+    <w:basedOn w:val="904"/>
     <w:uiPriority w:val="59"/>
     <w:pPr>
       <w:pBdr/>
@@ -3957,9 +4097,9 @@
       </w:tcPr>
     </w:tblStylePr>
   </w:style>
-  <w:style w:type="table" w:styleId="16">
+  <w:style w:type="table" w:styleId="722">
     <w:name w:val="Plain Table 3"/>
-    <w:basedOn w:val="665"/>
+    <w:basedOn w:val="904"/>
     <w:uiPriority w:val="99"/>
     <w:pPr>
       <w:pBdr/>
@@ -4187,9 +4327,9 @@
       </w:tcPr>
     </w:tblStylePr>
   </w:style>
-  <w:style w:type="table" w:styleId="17">
+  <w:style w:type="table" w:styleId="723">
     <w:name w:val="Plain Table 4"/>
-    <w:basedOn w:val="665"/>
+    <w:basedOn w:val="904"/>
     <w:uiPriority w:val="99"/>
     <w:pPr>
       <w:pBdr/>
@@ -4403,9 +4543,9 @@
       </w:tcPr>
     </w:tblStylePr>
   </w:style>
-  <w:style w:type="table" w:styleId="18">
+  <w:style w:type="table" w:styleId="724">
     <w:name w:val="Plain Table 5"/>
-    <w:basedOn w:val="665"/>
+    <w:basedOn w:val="904"/>
     <w:uiPriority w:val="99"/>
     <w:pPr>
       <w:pBdr/>
@@ -4636,9 +4776,9 @@
       </w:tcPr>
     </w:tblStylePr>
   </w:style>
-  <w:style w:type="table" w:styleId="19">
+  <w:style w:type="table" w:styleId="725">
     <w:name w:val="Grid Table 1 Light"/>
-    <w:basedOn w:val="665"/>
+    <w:basedOn w:val="904"/>
     <w:uiPriority w:val="99"/>
     <w:pPr>
       <w:pBdr/>
@@ -4859,9 +4999,9 @@
       </w:tcPr>
     </w:tblStylePr>
   </w:style>
-  <w:style w:type="table" w:styleId="20">
+  <w:style w:type="table" w:styleId="726">
     <w:name w:val="Grid Table 1 Light - Accent 1"/>
-    <w:basedOn w:val="665"/>
+    <w:basedOn w:val="904"/>
     <w:uiPriority w:val="99"/>
     <w:pPr>
       <w:pBdr/>
@@ -5082,9 +5222,9 @@
       </w:tcPr>
     </w:tblStylePr>
   </w:style>
-  <w:style w:type="table" w:styleId="21">
+  <w:style w:type="table" w:styleId="727">
     <w:name w:val="Grid Table 1 Light - Accent 2"/>
-    <w:basedOn w:val="665"/>
+    <w:basedOn w:val="904"/>
     <w:uiPriority w:val="99"/>
     <w:pPr>
       <w:pBdr/>
@@ -5305,9 +5445,9 @@
       </w:tcPr>
     </w:tblStylePr>
   </w:style>
-  <w:style w:type="table" w:styleId="22">
+  <w:style w:type="table" w:styleId="728">
     <w:name w:val="Grid Table 1 Light - Accent 3"/>
-    <w:basedOn w:val="665"/>
+    <w:basedOn w:val="904"/>
     <w:uiPriority w:val="99"/>
     <w:pPr>
       <w:pBdr/>
@@ -5528,9 +5668,9 @@
       </w:tcPr>
     </w:tblStylePr>
   </w:style>
-  <w:style w:type="table" w:styleId="23">
+  <w:style w:type="table" w:styleId="729">
     <w:name w:val="Grid Table 1 Light - Accent 4"/>
-    <w:basedOn w:val="665"/>
+    <w:basedOn w:val="904"/>
     <w:uiPriority w:val="99"/>
     <w:pPr>
       <w:pBdr/>
@@ -5751,9 +5891,9 @@
       </w:tcPr>
     </w:tblStylePr>
   </w:style>
-  <w:style w:type="table" w:styleId="24">
+  <w:style w:type="table" w:styleId="730">
     <w:name w:val="Grid Table 1 Light - Accent 5"/>
-    <w:basedOn w:val="665"/>
+    <w:basedOn w:val="904"/>
     <w:uiPriority w:val="99"/>
     <w:pPr>
       <w:pBdr/>
@@ -5974,9 +6114,9 @@
       </w:tcPr>
     </w:tblStylePr>
   </w:style>
-  <w:style w:type="table" w:styleId="25">
+  <w:style w:type="table" w:styleId="731">
     <w:name w:val="Grid Table 1 Light - Accent 6"/>
-    <w:basedOn w:val="665"/>
+    <w:basedOn w:val="904"/>
     <w:uiPriority w:val="99"/>
     <w:pPr>
       <w:pBdr/>
@@ -6197,9 +6337,9 @@
       </w:tcPr>
     </w:tblStylePr>
   </w:style>
-  <w:style w:type="table" w:styleId="26">
+  <w:style w:type="table" w:styleId="732">
     <w:name w:val="Grid Table 2"/>
-    <w:basedOn w:val="665"/>
+    <w:basedOn w:val="904"/>
     <w:uiPriority w:val="99"/>
     <w:pPr>
       <w:pBdr/>
@@ -6429,9 +6569,9 @@
       </w:tcPr>
     </w:tblStylePr>
   </w:style>
-  <w:style w:type="table" w:styleId="27">
+  <w:style w:type="table" w:styleId="733">
     <w:name w:val="Grid Table 2 - Accent 1"/>
-    <w:basedOn w:val="665"/>
+    <w:basedOn w:val="904"/>
     <w:uiPriority w:val="99"/>
     <w:pPr>
       <w:pBdr/>
@@ -6661,9 +6801,9 @@
       </w:tcPr>
     </w:tblStylePr>
   </w:style>
-  <w:style w:type="table" w:styleId="28">
+  <w:style w:type="table" w:styleId="734">
     <w:name w:val="Grid Table 2 - Accent 2"/>
-    <w:basedOn w:val="665"/>
+    <w:basedOn w:val="904"/>
     <w:uiPriority w:val="99"/>
     <w:pPr>
       <w:pBdr/>
@@ -6893,9 +7033,9 @@
       </w:tcPr>
     </w:tblStylePr>
   </w:style>
-  <w:style w:type="table" w:styleId="29">
+  <w:style w:type="table" w:styleId="735">
     <w:name w:val="Grid Table 2 - Accent 3"/>
-    <w:basedOn w:val="665"/>
+    <w:basedOn w:val="904"/>
     <w:uiPriority w:val="99"/>
     <w:pPr>
       <w:pBdr/>
@@ -7125,9 +7265,9 @@
       </w:tcPr>
     </w:tblStylePr>
   </w:style>
-  <w:style w:type="table" w:styleId="30">
+  <w:style w:type="table" w:styleId="736">
     <w:name w:val="Grid Table 2 - Accent 4"/>
-    <w:basedOn w:val="665"/>
+    <w:basedOn w:val="904"/>
     <w:uiPriority w:val="99"/>
     <w:pPr>
       <w:pBdr/>
@@ -7357,9 +7497,9 @@
       </w:tcPr>
     </w:tblStylePr>
   </w:style>
-  <w:style w:type="table" w:styleId="31">
+  <w:style w:type="table" w:styleId="737">
     <w:name w:val="Grid Table 2 - Accent 5"/>
-    <w:basedOn w:val="665"/>
+    <w:basedOn w:val="904"/>
     <w:uiPriority w:val="99"/>
     <w:pPr>
       <w:pBdr/>
@@ -7589,9 +7729,9 @@
       </w:tcPr>
     </w:tblStylePr>
   </w:style>
-  <w:style w:type="table" w:styleId="32">
+  <w:style w:type="table" w:styleId="738">
     <w:name w:val="Grid Table 2 - Accent 6"/>
-    <w:basedOn w:val="665"/>
+    <w:basedOn w:val="904"/>
     <w:uiPriority w:val="99"/>
     <w:pPr>
       <w:pBdr/>
@@ -7821,9 +7961,9 @@
       </w:tcPr>
     </w:tblStylePr>
   </w:style>
-  <w:style w:type="table" w:styleId="33">
+  <w:style w:type="table" w:styleId="739">
     <w:name w:val="Grid Table 3"/>
-    <w:basedOn w:val="665"/>
+    <w:basedOn w:val="904"/>
     <w:uiPriority w:val="99"/>
     <w:pPr>
       <w:pBdr/>
@@ -7922,29 +8062,6 @@
         <w:tblBorders/>
       </w:tblPr>
       <w:tcPr>
-        <w:shd w:color="ffffff"/>
-        <w:tcBorders>
-          <w:top w:val="none" w:color="000000" w:sz="4" w:space="0"/>
-          <w:left w:val="none" w:color="000000" w:sz="4" w:space="0"/>
-          <w:bottom w:val="none" w:color="000000" w:sz="4" w:space="0"/>
-          <w:right w:val="none" w:color="000000" w:sz="4" w:space="0"/>
-        </w:tcBorders>
-      </w:tcPr>
-    </w:tblStylePr>
-    <w:tblStylePr w:type="firstRow">
-      <w:rPr>
-        <w:b/>
-        <w:color w:val="404040"/>
-      </w:rPr>
-      <w:pPr>
-        <w:pBdr/>
-        <w:spacing/>
-        <w:ind/>
-      </w:pPr>
-      <w:tblPr>
-        <w:tblBorders/>
-      </w:tblPr>
-      <w:tcPr>
         <w:shd w:val="clear" w:color="ffffff"/>
         <w:tcBorders>
           <w:top w:val="none" w:color="000000" w:sz="4" w:space="0"/>
@@ -7954,30 +8071,7 @@
         </w:tcBorders>
       </w:tcPr>
     </w:tblStylePr>
-    <w:tblStylePr w:type="lastCol">
-      <w:rPr>
-        <w:i/>
-        <w:color w:val="404040"/>
-      </w:rPr>
-      <w:pPr>
-        <w:pBdr/>
-        <w:spacing/>
-        <w:ind/>
-      </w:pPr>
-      <w:tblPr>
-        <w:tblBorders/>
-      </w:tblPr>
-      <w:tcPr>
-        <w:shd w:color="ffffff"/>
-        <w:tcBorders>
-          <w:top w:val="none" w:color="000000" w:sz="4" w:space="0"/>
-          <w:left w:val="none" w:color="000000" w:sz="4" w:space="0"/>
-          <w:bottom w:val="none" w:color="000000" w:sz="4" w:space="0"/>
-          <w:right w:val="none" w:color="000000" w:sz="4" w:space="0"/>
-        </w:tcBorders>
-      </w:tcPr>
-    </w:tblStylePr>
-    <w:tblStylePr w:type="lastRow">
+    <w:tblStylePr w:type="firstRow">
       <w:rPr>
         <w:b/>
         <w:color w:val="404040"/>
@@ -8000,6 +8094,52 @@
         </w:tcBorders>
       </w:tcPr>
     </w:tblStylePr>
+    <w:tblStylePr w:type="lastCol">
+      <w:rPr>
+        <w:i/>
+        <w:color w:val="404040"/>
+      </w:rPr>
+      <w:pPr>
+        <w:pBdr/>
+        <w:spacing/>
+        <w:ind/>
+      </w:pPr>
+      <w:tblPr>
+        <w:tblBorders/>
+      </w:tblPr>
+      <w:tcPr>
+        <w:shd w:val="clear" w:color="ffffff"/>
+        <w:tcBorders>
+          <w:top w:val="none" w:color="000000" w:sz="4" w:space="0"/>
+          <w:left w:val="none" w:color="000000" w:sz="4" w:space="0"/>
+          <w:bottom w:val="none" w:color="000000" w:sz="4" w:space="0"/>
+          <w:right w:val="none" w:color="000000" w:sz="4" w:space="0"/>
+        </w:tcBorders>
+      </w:tcPr>
+    </w:tblStylePr>
+    <w:tblStylePr w:type="lastRow">
+      <w:rPr>
+        <w:b/>
+        <w:color w:val="404040"/>
+      </w:rPr>
+      <w:pPr>
+        <w:pBdr/>
+        <w:spacing/>
+        <w:ind/>
+      </w:pPr>
+      <w:tblPr>
+        <w:tblBorders/>
+      </w:tblPr>
+      <w:tcPr>
+        <w:shd w:val="clear" w:color="ffffff"/>
+        <w:tcBorders>
+          <w:top w:val="none" w:color="000000" w:sz="4" w:space="0"/>
+          <w:left w:val="none" w:color="000000" w:sz="4" w:space="0"/>
+          <w:bottom w:val="none" w:color="000000" w:sz="4" w:space="0"/>
+          <w:right w:val="none" w:color="000000" w:sz="4" w:space="0"/>
+        </w:tcBorders>
+      </w:tcPr>
+    </w:tblStylePr>
     <w:tblStylePr w:type="nwCell">
       <w:pPr>
         <w:pBdr/>
@@ -8066,9 +8206,9 @@
       </w:tcPr>
     </w:tblStylePr>
   </w:style>
-  <w:style w:type="table" w:styleId="34">
+  <w:style w:type="table" w:styleId="740">
     <w:name w:val="Grid Table 3 - Accent 1"/>
-    <w:basedOn w:val="665"/>
+    <w:basedOn w:val="904"/>
     <w:uiPriority w:val="99"/>
     <w:pPr>
       <w:pBdr/>
@@ -8167,29 +8307,6 @@
         <w:tblBorders/>
       </w:tblPr>
       <w:tcPr>
-        <w:shd w:color="ffffff"/>
-        <w:tcBorders>
-          <w:top w:val="none" w:color="000000" w:sz="4" w:space="0"/>
-          <w:left w:val="none" w:color="000000" w:sz="4" w:space="0"/>
-          <w:bottom w:val="none" w:color="000000" w:sz="4" w:space="0"/>
-          <w:right w:val="none" w:color="000000" w:sz="4" w:space="0"/>
-        </w:tcBorders>
-      </w:tcPr>
-    </w:tblStylePr>
-    <w:tblStylePr w:type="firstRow">
-      <w:rPr>
-        <w:b/>
-        <w:color w:val="404040"/>
-      </w:rPr>
-      <w:pPr>
-        <w:pBdr/>
-        <w:spacing/>
-        <w:ind/>
-      </w:pPr>
-      <w:tblPr>
-        <w:tblBorders/>
-      </w:tblPr>
-      <w:tcPr>
         <w:shd w:val="clear" w:color="ffffff"/>
         <w:tcBorders>
           <w:top w:val="none" w:color="000000" w:sz="4" w:space="0"/>
@@ -8199,30 +8316,7 @@
         </w:tcBorders>
       </w:tcPr>
     </w:tblStylePr>
-    <w:tblStylePr w:type="lastCol">
-      <w:rPr>
-        <w:i/>
-        <w:color w:val="404040"/>
-      </w:rPr>
-      <w:pPr>
-        <w:pBdr/>
-        <w:spacing/>
-        <w:ind/>
-      </w:pPr>
-      <w:tblPr>
-        <w:tblBorders/>
-      </w:tblPr>
-      <w:tcPr>
-        <w:shd w:color="ffffff"/>
-        <w:tcBorders>
-          <w:top w:val="none" w:color="000000" w:sz="4" w:space="0"/>
-          <w:left w:val="none" w:color="000000" w:sz="4" w:space="0"/>
-          <w:bottom w:val="none" w:color="000000" w:sz="4" w:space="0"/>
-          <w:right w:val="none" w:color="000000" w:sz="4" w:space="0"/>
-        </w:tcBorders>
-      </w:tcPr>
-    </w:tblStylePr>
-    <w:tblStylePr w:type="lastRow">
+    <w:tblStylePr w:type="firstRow">
       <w:rPr>
         <w:b/>
         <w:color w:val="404040"/>
@@ -8245,6 +8339,52 @@
         </w:tcBorders>
       </w:tcPr>
     </w:tblStylePr>
+    <w:tblStylePr w:type="lastCol">
+      <w:rPr>
+        <w:i/>
+        <w:color w:val="404040"/>
+      </w:rPr>
+      <w:pPr>
+        <w:pBdr/>
+        <w:spacing/>
+        <w:ind/>
+      </w:pPr>
+      <w:tblPr>
+        <w:tblBorders/>
+      </w:tblPr>
+      <w:tcPr>
+        <w:shd w:val="clear" w:color="ffffff"/>
+        <w:tcBorders>
+          <w:top w:val="none" w:color="000000" w:sz="4" w:space="0"/>
+          <w:left w:val="none" w:color="000000" w:sz="4" w:space="0"/>
+          <w:bottom w:val="none" w:color="000000" w:sz="4" w:space="0"/>
+          <w:right w:val="none" w:color="000000" w:sz="4" w:space="0"/>
+        </w:tcBorders>
+      </w:tcPr>
+    </w:tblStylePr>
+    <w:tblStylePr w:type="lastRow">
+      <w:rPr>
+        <w:b/>
+        <w:color w:val="404040"/>
+      </w:rPr>
+      <w:pPr>
+        <w:pBdr/>
+        <w:spacing/>
+        <w:ind/>
+      </w:pPr>
+      <w:tblPr>
+        <w:tblBorders/>
+      </w:tblPr>
+      <w:tcPr>
+        <w:shd w:val="clear" w:color="ffffff"/>
+        <w:tcBorders>
+          <w:top w:val="none" w:color="000000" w:sz="4" w:space="0"/>
+          <w:left w:val="none" w:color="000000" w:sz="4" w:space="0"/>
+          <w:bottom w:val="none" w:color="000000" w:sz="4" w:space="0"/>
+          <w:right w:val="none" w:color="000000" w:sz="4" w:space="0"/>
+        </w:tcBorders>
+      </w:tcPr>
+    </w:tblStylePr>
     <w:tblStylePr w:type="nwCell">
       <w:pPr>
         <w:pBdr/>
@@ -8311,9 +8451,9 @@
       </w:tcPr>
     </w:tblStylePr>
   </w:style>
-  <w:style w:type="table" w:styleId="35">
+  <w:style w:type="table" w:styleId="741">
     <w:name w:val="Grid Table 3 - Accent 2"/>
-    <w:basedOn w:val="665"/>
+    <w:basedOn w:val="904"/>
     <w:uiPriority w:val="99"/>
     <w:pPr>
       <w:pBdr/>
@@ -8412,29 +8552,6 @@
         <w:tblBorders/>
       </w:tblPr>
       <w:tcPr>
-        <w:shd w:color="ffffff"/>
-        <w:tcBorders>
-          <w:top w:val="none" w:color="000000" w:sz="4" w:space="0"/>
-          <w:left w:val="none" w:color="000000" w:sz="4" w:space="0"/>
-          <w:bottom w:val="none" w:color="000000" w:sz="4" w:space="0"/>
-          <w:right w:val="none" w:color="000000" w:sz="4" w:space="0"/>
-        </w:tcBorders>
-      </w:tcPr>
-    </w:tblStylePr>
-    <w:tblStylePr w:type="firstRow">
-      <w:rPr>
-        <w:b/>
-        <w:color w:val="404040"/>
-      </w:rPr>
-      <w:pPr>
-        <w:pBdr/>
-        <w:spacing/>
-        <w:ind/>
-      </w:pPr>
-      <w:tblPr>
-        <w:tblBorders/>
-      </w:tblPr>
-      <w:tcPr>
         <w:shd w:val="clear" w:color="ffffff"/>
         <w:tcBorders>
           <w:top w:val="none" w:color="000000" w:sz="4" w:space="0"/>
@@ -8444,30 +8561,7 @@
         </w:tcBorders>
       </w:tcPr>
     </w:tblStylePr>
-    <w:tblStylePr w:type="lastCol">
-      <w:rPr>
-        <w:i/>
-        <w:color w:val="404040"/>
-      </w:rPr>
-      <w:pPr>
-        <w:pBdr/>
-        <w:spacing/>
-        <w:ind/>
-      </w:pPr>
-      <w:tblPr>
-        <w:tblBorders/>
-      </w:tblPr>
-      <w:tcPr>
-        <w:shd w:color="ffffff"/>
-        <w:tcBorders>
-          <w:top w:val="none" w:color="000000" w:sz="4" w:space="0"/>
-          <w:left w:val="none" w:color="000000" w:sz="4" w:space="0"/>
-          <w:bottom w:val="none" w:color="000000" w:sz="4" w:space="0"/>
-          <w:right w:val="none" w:color="000000" w:sz="4" w:space="0"/>
-        </w:tcBorders>
-      </w:tcPr>
-    </w:tblStylePr>
-    <w:tblStylePr w:type="lastRow">
+    <w:tblStylePr w:type="firstRow">
       <w:rPr>
         <w:b/>
         <w:color w:val="404040"/>
@@ -8490,6 +8584,52 @@
         </w:tcBorders>
       </w:tcPr>
     </w:tblStylePr>
+    <w:tblStylePr w:type="lastCol">
+      <w:rPr>
+        <w:i/>
+        <w:color w:val="404040"/>
+      </w:rPr>
+      <w:pPr>
+        <w:pBdr/>
+        <w:spacing/>
+        <w:ind/>
+      </w:pPr>
+      <w:tblPr>
+        <w:tblBorders/>
+      </w:tblPr>
+      <w:tcPr>
+        <w:shd w:val="clear" w:color="ffffff"/>
+        <w:tcBorders>
+          <w:top w:val="none" w:color="000000" w:sz="4" w:space="0"/>
+          <w:left w:val="none" w:color="000000" w:sz="4" w:space="0"/>
+          <w:bottom w:val="none" w:color="000000" w:sz="4" w:space="0"/>
+          <w:right w:val="none" w:color="000000" w:sz="4" w:space="0"/>
+        </w:tcBorders>
+      </w:tcPr>
+    </w:tblStylePr>
+    <w:tblStylePr w:type="lastRow">
+      <w:rPr>
+        <w:b/>
+        <w:color w:val="404040"/>
+      </w:rPr>
+      <w:pPr>
+        <w:pBdr/>
+        <w:spacing/>
+        <w:ind/>
+      </w:pPr>
+      <w:tblPr>
+        <w:tblBorders/>
+      </w:tblPr>
+      <w:tcPr>
+        <w:shd w:val="clear" w:color="ffffff"/>
+        <w:tcBorders>
+          <w:top w:val="none" w:color="000000" w:sz="4" w:space="0"/>
+          <w:left w:val="none" w:color="000000" w:sz="4" w:space="0"/>
+          <w:bottom w:val="none" w:color="000000" w:sz="4" w:space="0"/>
+          <w:right w:val="none" w:color="000000" w:sz="4" w:space="0"/>
+        </w:tcBorders>
+      </w:tcPr>
+    </w:tblStylePr>
     <w:tblStylePr w:type="nwCell">
       <w:pPr>
         <w:pBdr/>
@@ -8556,9 +8696,9 @@
       </w:tcPr>
     </w:tblStylePr>
   </w:style>
-  <w:style w:type="table" w:styleId="36">
+  <w:style w:type="table" w:styleId="742">
     <w:name w:val="Grid Table 3 - Accent 3"/>
-    <w:basedOn w:val="665"/>
+    <w:basedOn w:val="904"/>
     <w:uiPriority w:val="99"/>
     <w:pPr>
       <w:pBdr/>
@@ -8657,29 +8797,6 @@
         <w:tblBorders/>
       </w:tblPr>
       <w:tcPr>
-        <w:shd w:color="ffffff"/>
-        <w:tcBorders>
-          <w:top w:val="none" w:color="000000" w:sz="4" w:space="0"/>
-          <w:left w:val="none" w:color="000000" w:sz="4" w:space="0"/>
-          <w:bottom w:val="none" w:color="000000" w:sz="4" w:space="0"/>
-          <w:right w:val="none" w:color="000000" w:sz="4" w:space="0"/>
-        </w:tcBorders>
-      </w:tcPr>
-    </w:tblStylePr>
-    <w:tblStylePr w:type="firstRow">
-      <w:rPr>
-        <w:b/>
-        <w:color w:val="404040"/>
-      </w:rPr>
-      <w:pPr>
-        <w:pBdr/>
-        <w:spacing/>
-        <w:ind/>
-      </w:pPr>
-      <w:tblPr>
-        <w:tblBorders/>
-      </w:tblPr>
-      <w:tcPr>
         <w:shd w:val="clear" w:color="ffffff"/>
         <w:tcBorders>
           <w:top w:val="none" w:color="000000" w:sz="4" w:space="0"/>
@@ -8689,30 +8806,7 @@
         </w:tcBorders>
       </w:tcPr>
     </w:tblStylePr>
-    <w:tblStylePr w:type="lastCol">
-      <w:rPr>
-        <w:i/>
-        <w:color w:val="404040"/>
-      </w:rPr>
-      <w:pPr>
-        <w:pBdr/>
-        <w:spacing/>
-        <w:ind/>
-      </w:pPr>
-      <w:tblPr>
-        <w:tblBorders/>
-      </w:tblPr>
-      <w:tcPr>
-        <w:shd w:color="ffffff"/>
-        <w:tcBorders>
-          <w:top w:val="none" w:color="000000" w:sz="4" w:space="0"/>
-          <w:left w:val="none" w:color="000000" w:sz="4" w:space="0"/>
-          <w:bottom w:val="none" w:color="000000" w:sz="4" w:space="0"/>
-          <w:right w:val="none" w:color="000000" w:sz="4" w:space="0"/>
-        </w:tcBorders>
-      </w:tcPr>
-    </w:tblStylePr>
-    <w:tblStylePr w:type="lastRow">
+    <w:tblStylePr w:type="firstRow">
       <w:rPr>
         <w:b/>
         <w:color w:val="404040"/>
@@ -8735,6 +8829,52 @@
         </w:tcBorders>
       </w:tcPr>
     </w:tblStylePr>
+    <w:tblStylePr w:type="lastCol">
+      <w:rPr>
+        <w:i/>
+        <w:color w:val="404040"/>
+      </w:rPr>
+      <w:pPr>
+        <w:pBdr/>
+        <w:spacing/>
+        <w:ind/>
+      </w:pPr>
+      <w:tblPr>
+        <w:tblBorders/>
+      </w:tblPr>
+      <w:tcPr>
+        <w:shd w:val="clear" w:color="ffffff"/>
+        <w:tcBorders>
+          <w:top w:val="none" w:color="000000" w:sz="4" w:space="0"/>
+          <w:left w:val="none" w:color="000000" w:sz="4" w:space="0"/>
+          <w:bottom w:val="none" w:color="000000" w:sz="4" w:space="0"/>
+          <w:right w:val="none" w:color="000000" w:sz="4" w:space="0"/>
+        </w:tcBorders>
+      </w:tcPr>
+    </w:tblStylePr>
+    <w:tblStylePr w:type="lastRow">
+      <w:rPr>
+        <w:b/>
+        <w:color w:val="404040"/>
+      </w:rPr>
+      <w:pPr>
+        <w:pBdr/>
+        <w:spacing/>
+        <w:ind/>
+      </w:pPr>
+      <w:tblPr>
+        <w:tblBorders/>
+      </w:tblPr>
+      <w:tcPr>
+        <w:shd w:val="clear" w:color="ffffff"/>
+        <w:tcBorders>
+          <w:top w:val="none" w:color="000000" w:sz="4" w:space="0"/>
+          <w:left w:val="none" w:color="000000" w:sz="4" w:space="0"/>
+          <w:bottom w:val="none" w:color="000000" w:sz="4" w:space="0"/>
+          <w:right w:val="none" w:color="000000" w:sz="4" w:space="0"/>
+        </w:tcBorders>
+      </w:tcPr>
+    </w:tblStylePr>
     <w:tblStylePr w:type="nwCell">
       <w:pPr>
         <w:pBdr/>
@@ -8801,9 +8941,9 @@
       </w:tcPr>
     </w:tblStylePr>
   </w:style>
-  <w:style w:type="table" w:styleId="37">
+  <w:style w:type="table" w:styleId="743">
     <w:name w:val="Grid Table 3 - Accent 4"/>
-    <w:basedOn w:val="665"/>
+    <w:basedOn w:val="904"/>
     <w:uiPriority w:val="99"/>
     <w:pPr>
       <w:pBdr/>
@@ -8902,29 +9042,6 @@
         <w:tblBorders/>
       </w:tblPr>
       <w:tcPr>
-        <w:shd w:color="ffffff"/>
-        <w:tcBorders>
-          <w:top w:val="none" w:color="000000" w:sz="4" w:space="0"/>
-          <w:left w:val="none" w:color="000000" w:sz="4" w:space="0"/>
-          <w:bottom w:val="none" w:color="000000" w:sz="4" w:space="0"/>
-          <w:right w:val="none" w:color="000000" w:sz="4" w:space="0"/>
-        </w:tcBorders>
-      </w:tcPr>
-    </w:tblStylePr>
-    <w:tblStylePr w:type="firstRow">
-      <w:rPr>
-        <w:b/>
-        <w:color w:val="404040"/>
-      </w:rPr>
-      <w:pPr>
-        <w:pBdr/>
-        <w:spacing/>
-        <w:ind/>
-      </w:pPr>
-      <w:tblPr>
-        <w:tblBorders/>
-      </w:tblPr>
-      <w:tcPr>
         <w:shd w:val="clear" w:color="ffffff"/>
         <w:tcBorders>
           <w:top w:val="none" w:color="000000" w:sz="4" w:space="0"/>
@@ -8934,30 +9051,7 @@
         </w:tcBorders>
       </w:tcPr>
     </w:tblStylePr>
-    <w:tblStylePr w:type="lastCol">
-      <w:rPr>
-        <w:i/>
-        <w:color w:val="404040"/>
-      </w:rPr>
-      <w:pPr>
-        <w:pBdr/>
-        <w:spacing/>
-        <w:ind/>
-      </w:pPr>
-      <w:tblPr>
-        <w:tblBorders/>
-      </w:tblPr>
-      <w:tcPr>
-        <w:shd w:color="ffffff"/>
-        <w:tcBorders>
-          <w:top w:val="none" w:color="000000" w:sz="4" w:space="0"/>
-          <w:left w:val="none" w:color="000000" w:sz="4" w:space="0"/>
-          <w:bottom w:val="none" w:color="000000" w:sz="4" w:space="0"/>
-          <w:right w:val="none" w:color="000000" w:sz="4" w:space="0"/>
-        </w:tcBorders>
-      </w:tcPr>
-    </w:tblStylePr>
-    <w:tblStylePr w:type="lastRow">
+    <w:tblStylePr w:type="firstRow">
       <w:rPr>
         <w:b/>
         <w:color w:val="404040"/>
@@ -8980,6 +9074,52 @@
         </w:tcBorders>
       </w:tcPr>
     </w:tblStylePr>
+    <w:tblStylePr w:type="lastCol">
+      <w:rPr>
+        <w:i/>
+        <w:color w:val="404040"/>
+      </w:rPr>
+      <w:pPr>
+        <w:pBdr/>
+        <w:spacing/>
+        <w:ind/>
+      </w:pPr>
+      <w:tblPr>
+        <w:tblBorders/>
+      </w:tblPr>
+      <w:tcPr>
+        <w:shd w:val="clear" w:color="ffffff"/>
+        <w:tcBorders>
+          <w:top w:val="none" w:color="000000" w:sz="4" w:space="0"/>
+          <w:left w:val="none" w:color="000000" w:sz="4" w:space="0"/>
+          <w:bottom w:val="none" w:color="000000" w:sz="4" w:space="0"/>
+          <w:right w:val="none" w:color="000000" w:sz="4" w:space="0"/>
+        </w:tcBorders>
+      </w:tcPr>
+    </w:tblStylePr>
+    <w:tblStylePr w:type="lastRow">
+      <w:rPr>
+        <w:b/>
+        <w:color w:val="404040"/>
+      </w:rPr>
+      <w:pPr>
+        <w:pBdr/>
+        <w:spacing/>
+        <w:ind/>
+      </w:pPr>
+      <w:tblPr>
+        <w:tblBorders/>
+      </w:tblPr>
+      <w:tcPr>
+        <w:shd w:val="clear" w:color="ffffff"/>
+        <w:tcBorders>
+          <w:top w:val="none" w:color="000000" w:sz="4" w:space="0"/>
+          <w:left w:val="none" w:color="000000" w:sz="4" w:space="0"/>
+          <w:bottom w:val="none" w:color="000000" w:sz="4" w:space="0"/>
+          <w:right w:val="none" w:color="000000" w:sz="4" w:space="0"/>
+        </w:tcBorders>
+      </w:tcPr>
+    </w:tblStylePr>
     <w:tblStylePr w:type="nwCell">
       <w:pPr>
         <w:pBdr/>
@@ -9046,9 +9186,9 @@
       </w:tcPr>
     </w:tblStylePr>
   </w:style>
-  <w:style w:type="table" w:styleId="38">
+  <w:style w:type="table" w:styleId="744">
     <w:name w:val="Grid Table 3 - Accent 5"/>
-    <w:basedOn w:val="665"/>
+    <w:basedOn w:val="904"/>
     <w:uiPriority w:val="99"/>
     <w:pPr>
       <w:pBdr/>
@@ -9147,29 +9287,6 @@
         <w:tblBorders/>
       </w:tblPr>
       <w:tcPr>
-        <w:shd w:color="ffffff"/>
-        <w:tcBorders>
-          <w:top w:val="none" w:color="000000" w:sz="4" w:space="0"/>
-          <w:left w:val="none" w:color="000000" w:sz="4" w:space="0"/>
-          <w:bottom w:val="none" w:color="000000" w:sz="4" w:space="0"/>
-          <w:right w:val="none" w:color="000000" w:sz="4" w:space="0"/>
-        </w:tcBorders>
-      </w:tcPr>
-    </w:tblStylePr>
-    <w:tblStylePr w:type="firstRow">
-      <w:rPr>
-        <w:b/>
-        <w:color w:val="404040"/>
-      </w:rPr>
-      <w:pPr>
-        <w:pBdr/>
-        <w:spacing/>
-        <w:ind/>
-      </w:pPr>
-      <w:tblPr>
-        <w:tblBorders/>
-      </w:tblPr>
-      <w:tcPr>
         <w:shd w:val="clear" w:color="ffffff"/>
         <w:tcBorders>
           <w:top w:val="none" w:color="000000" w:sz="4" w:space="0"/>
@@ -9179,30 +9296,7 @@
         </w:tcBorders>
       </w:tcPr>
     </w:tblStylePr>
-    <w:tblStylePr w:type="lastCol">
-      <w:rPr>
-        <w:i/>
-        <w:color w:val="404040"/>
-      </w:rPr>
-      <w:pPr>
-        <w:pBdr/>
-        <w:spacing/>
-        <w:ind/>
-      </w:pPr>
-      <w:tblPr>
-        <w:tblBorders/>
-      </w:tblPr>
-      <w:tcPr>
-        <w:shd w:color="ffffff"/>
-        <w:tcBorders>
-          <w:top w:val="none" w:color="000000" w:sz="4" w:space="0"/>
-          <w:left w:val="none" w:color="000000" w:sz="4" w:space="0"/>
-          <w:bottom w:val="none" w:color="000000" w:sz="4" w:space="0"/>
-          <w:right w:val="none" w:color="000000" w:sz="4" w:space="0"/>
-        </w:tcBorders>
-      </w:tcPr>
-    </w:tblStylePr>
-    <w:tblStylePr w:type="lastRow">
+    <w:tblStylePr w:type="firstRow">
       <w:rPr>
         <w:b/>
         <w:color w:val="404040"/>
@@ -9225,6 +9319,52 @@
         </w:tcBorders>
       </w:tcPr>
     </w:tblStylePr>
+    <w:tblStylePr w:type="lastCol">
+      <w:rPr>
+        <w:i/>
+        <w:color w:val="404040"/>
+      </w:rPr>
+      <w:pPr>
+        <w:pBdr/>
+        <w:spacing/>
+        <w:ind/>
+      </w:pPr>
+      <w:tblPr>
+        <w:tblBorders/>
+      </w:tblPr>
+      <w:tcPr>
+        <w:shd w:val="clear" w:color="ffffff"/>
+        <w:tcBorders>
+          <w:top w:val="none" w:color="000000" w:sz="4" w:space="0"/>
+          <w:left w:val="none" w:color="000000" w:sz="4" w:space="0"/>
+          <w:bottom w:val="none" w:color="000000" w:sz="4" w:space="0"/>
+          <w:right w:val="none" w:color="000000" w:sz="4" w:space="0"/>
+        </w:tcBorders>
+      </w:tcPr>
+    </w:tblStylePr>
+    <w:tblStylePr w:type="lastRow">
+      <w:rPr>
+        <w:b/>
+        <w:color w:val="404040"/>
+      </w:rPr>
+      <w:pPr>
+        <w:pBdr/>
+        <w:spacing/>
+        <w:ind/>
+      </w:pPr>
+      <w:tblPr>
+        <w:tblBorders/>
+      </w:tblPr>
+      <w:tcPr>
+        <w:shd w:val="clear" w:color="ffffff"/>
+        <w:tcBorders>
+          <w:top w:val="none" w:color="000000" w:sz="4" w:space="0"/>
+          <w:left w:val="none" w:color="000000" w:sz="4" w:space="0"/>
+          <w:bottom w:val="none" w:color="000000" w:sz="4" w:space="0"/>
+          <w:right w:val="none" w:color="000000" w:sz="4" w:space="0"/>
+        </w:tcBorders>
+      </w:tcPr>
+    </w:tblStylePr>
     <w:tblStylePr w:type="nwCell">
       <w:pPr>
         <w:pBdr/>
@@ -9291,9 +9431,9 @@
       </w:tcPr>
     </w:tblStylePr>
   </w:style>
-  <w:style w:type="table" w:styleId="39">
+  <w:style w:type="table" w:styleId="745">
     <w:name w:val="Grid Table 3 - Accent 6"/>
-    <w:basedOn w:val="665"/>
+    <w:basedOn w:val="904"/>
     <w:uiPriority w:val="99"/>
     <w:pPr>
       <w:pBdr/>
@@ -9392,29 +9532,6 @@
         <w:tblBorders/>
       </w:tblPr>
       <w:tcPr>
-        <w:shd w:color="ffffff"/>
-        <w:tcBorders>
-          <w:top w:val="none" w:color="000000" w:sz="4" w:space="0"/>
-          <w:left w:val="none" w:color="000000" w:sz="4" w:space="0"/>
-          <w:bottom w:val="none" w:color="000000" w:sz="4" w:space="0"/>
-          <w:right w:val="none" w:color="000000" w:sz="4" w:space="0"/>
-        </w:tcBorders>
-      </w:tcPr>
-    </w:tblStylePr>
-    <w:tblStylePr w:type="firstRow">
-      <w:rPr>
-        <w:b/>
-        <w:color w:val="404040"/>
-      </w:rPr>
-      <w:pPr>
-        <w:pBdr/>
-        <w:spacing/>
-        <w:ind/>
-      </w:pPr>
-      <w:tblPr>
-        <w:tblBorders/>
-      </w:tblPr>
-      <w:tcPr>
         <w:shd w:val="clear" w:color="ffffff"/>
         <w:tcBorders>
           <w:top w:val="none" w:color="000000" w:sz="4" w:space="0"/>
@@ -9424,30 +9541,7 @@
         </w:tcBorders>
       </w:tcPr>
     </w:tblStylePr>
-    <w:tblStylePr w:type="lastCol">
-      <w:rPr>
-        <w:i/>
-        <w:color w:val="404040"/>
-      </w:rPr>
-      <w:pPr>
-        <w:pBdr/>
-        <w:spacing/>
-        <w:ind/>
-      </w:pPr>
-      <w:tblPr>
-        <w:tblBorders/>
-      </w:tblPr>
-      <w:tcPr>
-        <w:shd w:color="ffffff"/>
-        <w:tcBorders>
-          <w:top w:val="none" w:color="000000" w:sz="4" w:space="0"/>
-          <w:left w:val="none" w:color="000000" w:sz="4" w:space="0"/>
-          <w:bottom w:val="none" w:color="000000" w:sz="4" w:space="0"/>
-          <w:right w:val="none" w:color="000000" w:sz="4" w:space="0"/>
-        </w:tcBorders>
-      </w:tcPr>
-    </w:tblStylePr>
-    <w:tblStylePr w:type="lastRow">
+    <w:tblStylePr w:type="firstRow">
       <w:rPr>
         <w:b/>
         <w:color w:val="404040"/>
@@ -9470,6 +9564,52 @@
         </w:tcBorders>
       </w:tcPr>
     </w:tblStylePr>
+    <w:tblStylePr w:type="lastCol">
+      <w:rPr>
+        <w:i/>
+        <w:color w:val="404040"/>
+      </w:rPr>
+      <w:pPr>
+        <w:pBdr/>
+        <w:spacing/>
+        <w:ind/>
+      </w:pPr>
+      <w:tblPr>
+        <w:tblBorders/>
+      </w:tblPr>
+      <w:tcPr>
+        <w:shd w:val="clear" w:color="ffffff"/>
+        <w:tcBorders>
+          <w:top w:val="none" w:color="000000" w:sz="4" w:space="0"/>
+          <w:left w:val="none" w:color="000000" w:sz="4" w:space="0"/>
+          <w:bottom w:val="none" w:color="000000" w:sz="4" w:space="0"/>
+          <w:right w:val="none" w:color="000000" w:sz="4" w:space="0"/>
+        </w:tcBorders>
+      </w:tcPr>
+    </w:tblStylePr>
+    <w:tblStylePr w:type="lastRow">
+      <w:rPr>
+        <w:b/>
+        <w:color w:val="404040"/>
+      </w:rPr>
+      <w:pPr>
+        <w:pBdr/>
+        <w:spacing/>
+        <w:ind/>
+      </w:pPr>
+      <w:tblPr>
+        <w:tblBorders/>
+      </w:tblPr>
+      <w:tcPr>
+        <w:shd w:val="clear" w:color="ffffff"/>
+        <w:tcBorders>
+          <w:top w:val="none" w:color="000000" w:sz="4" w:space="0"/>
+          <w:left w:val="none" w:color="000000" w:sz="4" w:space="0"/>
+          <w:bottom w:val="none" w:color="000000" w:sz="4" w:space="0"/>
+          <w:right w:val="none" w:color="000000" w:sz="4" w:space="0"/>
+        </w:tcBorders>
+      </w:tcPr>
+    </w:tblStylePr>
     <w:tblStylePr w:type="nwCell">
       <w:pPr>
         <w:pBdr/>
@@ -9536,9 +9676,9 @@
       </w:tcPr>
     </w:tblStylePr>
   </w:style>
-  <w:style w:type="table" w:styleId="40">
+  <w:style w:type="table" w:styleId="746">
     <w:name w:val="Grid Table 4"/>
-    <w:basedOn w:val="665"/>
+    <w:basedOn w:val="904"/>
     <w:uiPriority w:val="59"/>
     <w:pPr>
       <w:pBdr/>
@@ -9769,9 +9909,9 @@
       </w:tcPr>
     </w:tblStylePr>
   </w:style>
-  <w:style w:type="table" w:styleId="41">
+  <w:style w:type="table" w:styleId="747">
     <w:name w:val="Grid Table 4 - Accent 1"/>
-    <w:basedOn w:val="665"/>
+    <w:basedOn w:val="904"/>
     <w:uiPriority w:val="59"/>
     <w:pPr>
       <w:pBdr/>
@@ -10002,9 +10142,9 @@
       </w:tcPr>
     </w:tblStylePr>
   </w:style>
-  <w:style w:type="table" w:styleId="42">
+  <w:style w:type="table" w:styleId="748">
     <w:name w:val="Grid Table 4 - Accent 2"/>
-    <w:basedOn w:val="665"/>
+    <w:basedOn w:val="904"/>
     <w:uiPriority w:val="59"/>
     <w:pPr>
       <w:pBdr/>
@@ -10235,9 +10375,9 @@
       </w:tcPr>
     </w:tblStylePr>
   </w:style>
-  <w:style w:type="table" w:styleId="43">
+  <w:style w:type="table" w:styleId="749">
     <w:name w:val="Grid Table 4 - Accent 3"/>
-    <w:basedOn w:val="665"/>
+    <w:basedOn w:val="904"/>
     <w:uiPriority w:val="59"/>
     <w:pPr>
       <w:pBdr/>
@@ -10468,9 +10608,9 @@
       </w:tcPr>
     </w:tblStylePr>
   </w:style>
-  <w:style w:type="table" w:styleId="44">
+  <w:style w:type="table" w:styleId="750">
     <w:name w:val="Grid Table 4 - Accent 4"/>
-    <w:basedOn w:val="665"/>
+    <w:basedOn w:val="904"/>
     <w:uiPriority w:val="59"/>
     <w:pPr>
       <w:pBdr/>
@@ -10701,9 +10841,9 @@
       </w:tcPr>
     </w:tblStylePr>
   </w:style>
-  <w:style w:type="table" w:styleId="45">
+  <w:style w:type="table" w:styleId="751">
     <w:name w:val="Grid Table 4 - Accent 5"/>
-    <w:basedOn w:val="665"/>
+    <w:basedOn w:val="904"/>
     <w:uiPriority w:val="59"/>
     <w:pPr>
       <w:pBdr/>
@@ -10934,9 +11074,9 @@
       </w:tcPr>
     </w:tblStylePr>
   </w:style>
-  <w:style w:type="table" w:styleId="46">
+  <w:style w:type="table" w:styleId="752">
     <w:name w:val="Grid Table 4 - Accent 6"/>
-    <w:basedOn w:val="665"/>
+    <w:basedOn w:val="904"/>
     <w:uiPriority w:val="59"/>
     <w:pPr>
       <w:pBdr/>
@@ -11167,9 +11307,9 @@
       </w:tcPr>
     </w:tblStylePr>
   </w:style>
-  <w:style w:type="table" w:styleId="47">
+  <w:style w:type="table" w:styleId="753">
     <w:name w:val="Grid Table 5 Dark"/>
-    <w:basedOn w:val="665"/>
+    <w:basedOn w:val="904"/>
     <w:uiPriority w:val="99"/>
     <w:pPr>
       <w:pBdr/>
@@ -11395,9 +11535,9 @@
       </w:tcPr>
     </w:tblStylePr>
   </w:style>
-  <w:style w:type="table" w:styleId="48">
+  <w:style w:type="table" w:styleId="754">
     <w:name w:val="Grid Table 5 Dark- Accent 1"/>
-    <w:basedOn w:val="665"/>
+    <w:basedOn w:val="904"/>
     <w:uiPriority w:val="99"/>
     <w:pPr>
       <w:pBdr/>
@@ -11623,9 +11763,9 @@
       </w:tcPr>
     </w:tblStylePr>
   </w:style>
-  <w:style w:type="table" w:styleId="49">
+  <w:style w:type="table" w:styleId="755">
     <w:name w:val="Grid Table 5 Dark - Accent 2"/>
-    <w:basedOn w:val="665"/>
+    <w:basedOn w:val="904"/>
     <w:uiPriority w:val="99"/>
     <w:pPr>
       <w:pBdr/>
@@ -11851,9 +11991,9 @@
       </w:tcPr>
     </w:tblStylePr>
   </w:style>
-  <w:style w:type="table" w:styleId="50">
+  <w:style w:type="table" w:styleId="756">
     <w:name w:val="Grid Table 5 Dark - Accent 3"/>
-    <w:basedOn w:val="665"/>
+    <w:basedOn w:val="904"/>
     <w:uiPriority w:val="99"/>
     <w:pPr>
       <w:pBdr/>
@@ -12079,9 +12219,9 @@
       </w:tcPr>
     </w:tblStylePr>
   </w:style>
-  <w:style w:type="table" w:styleId="51">
+  <w:style w:type="table" w:styleId="757">
     <w:name w:val="Grid Table 5 Dark- Accent 4"/>
-    <w:basedOn w:val="665"/>
+    <w:basedOn w:val="904"/>
     <w:uiPriority w:val="99"/>
     <w:pPr>
       <w:pBdr/>
@@ -12307,9 +12447,9 @@
       </w:tcPr>
     </w:tblStylePr>
   </w:style>
-  <w:style w:type="table" w:styleId="52">
+  <w:style w:type="table" w:styleId="758">
     <w:name w:val="Grid Table 5 Dark - Accent 5"/>
-    <w:basedOn w:val="665"/>
+    <w:basedOn w:val="904"/>
     <w:uiPriority w:val="99"/>
     <w:pPr>
       <w:pBdr/>
@@ -12535,9 +12675,9 @@
       </w:tcPr>
     </w:tblStylePr>
   </w:style>
-  <w:style w:type="table" w:styleId="53">
+  <w:style w:type="table" w:styleId="759">
     <w:name w:val="Grid Table 5 Dark - Accent 6"/>
-    <w:basedOn w:val="665"/>
+    <w:basedOn w:val="904"/>
     <w:uiPriority w:val="99"/>
     <w:pPr>
       <w:pBdr/>
@@ -12763,9 +12903,9 @@
       </w:tcPr>
     </w:tblStylePr>
   </w:style>
-  <w:style w:type="table" w:styleId="54">
+  <w:style w:type="table" w:styleId="760">
     <w:name w:val="Grid Table 6 Colorful"/>
-    <w:basedOn w:val="665"/>
+    <w:basedOn w:val="904"/>
     <w:uiPriority w:val="99"/>
     <w:pPr>
       <w:pBdr/>
@@ -12993,9 +13133,9 @@
       </w:tcPr>
     </w:tblStylePr>
   </w:style>
-  <w:style w:type="table" w:styleId="55">
+  <w:style w:type="table" w:styleId="761">
     <w:name w:val="Grid Table 6 Colorful - Accent 1"/>
-    <w:basedOn w:val="665"/>
+    <w:basedOn w:val="904"/>
     <w:uiPriority w:val="99"/>
     <w:pPr>
       <w:pBdr/>
@@ -13223,9 +13363,9 @@
       </w:tcPr>
     </w:tblStylePr>
   </w:style>
-  <w:style w:type="table" w:styleId="56">
+  <w:style w:type="table" w:styleId="762">
     <w:name w:val="Grid Table 6 Colorful - Accent 2"/>
-    <w:basedOn w:val="665"/>
+    <w:basedOn w:val="904"/>
     <w:uiPriority w:val="99"/>
     <w:pPr>
       <w:pBdr/>
@@ -13453,9 +13593,9 @@
       </w:tcPr>
     </w:tblStylePr>
   </w:style>
-  <w:style w:type="table" w:styleId="57">
+  <w:style w:type="table" w:styleId="763">
     <w:name w:val="Grid Table 6 Colorful - Accent 3"/>
-    <w:basedOn w:val="665"/>
+    <w:basedOn w:val="904"/>
     <w:uiPriority w:val="99"/>
     <w:pPr>
       <w:pBdr/>
@@ -13683,9 +13823,9 @@
       </w:tcPr>
     </w:tblStylePr>
   </w:style>
-  <w:style w:type="table" w:styleId="58">
+  <w:style w:type="table" w:styleId="764">
     <w:name w:val="Grid Table 6 Colorful - Accent 4"/>
-    <w:basedOn w:val="665"/>
+    <w:basedOn w:val="904"/>
     <w:uiPriority w:val="99"/>
     <w:pPr>
       <w:pBdr/>
@@ -13913,9 +14053,9 @@
       </w:tcPr>
     </w:tblStylePr>
   </w:style>
-  <w:style w:type="table" w:styleId="59">
+  <w:style w:type="table" w:styleId="765">
     <w:name w:val="Grid Table 6 Colorful - Accent 5"/>
-    <w:basedOn w:val="665"/>
+    <w:basedOn w:val="904"/>
     <w:uiPriority w:val="99"/>
     <w:pPr>
       <w:pBdr/>
@@ -14143,9 +14283,9 @@
       </w:tcPr>
     </w:tblStylePr>
   </w:style>
-  <w:style w:type="table" w:styleId="60">
+  <w:style w:type="table" w:styleId="766">
     <w:name w:val="Grid Table 6 Colorful - Accent 6"/>
-    <w:basedOn w:val="665"/>
+    <w:basedOn w:val="904"/>
     <w:uiPriority w:val="99"/>
     <w:pPr>
       <w:pBdr/>
@@ -14373,9 +14513,9 @@
       </w:tcPr>
     </w:tblStylePr>
   </w:style>
-  <w:style w:type="table" w:styleId="61">
+  <w:style w:type="table" w:styleId="767">
     <w:name w:val="Grid Table 7 Colorful"/>
-    <w:basedOn w:val="665"/>
+    <w:basedOn w:val="904"/>
     <w:uiPriority w:val="99"/>
     <w:pPr>
       <w:pBdr/>
@@ -14477,11 +14617,11 @@
         <w:tblBorders/>
       </w:tblPr>
       <w:tcPr>
-        <w:shd w:color="ffffff"/>
+        <w:shd w:val="clear" w:color="ffffff"/>
         <w:tcBorders>
-          <w:top w:val="none"/>
-          <w:left w:val="none"/>
-          <w:bottom w:val="none"/>
+          <w:top w:val="none" w:color="000000" w:sz="4" w:space="0"/>
+          <w:left w:val="none" w:color="000000" w:sz="4" w:space="0"/>
+          <w:bottom w:val="none" w:color="000000" w:sz="4" w:space="0"/>
           <w:right w:val="single" w:color="000000" w:themeColor="text1" w:themeTint="80" w:sz="4" w:space="0"/>
         </w:tcBorders>
       </w:tcPr>
@@ -14504,10 +14644,10 @@
       <w:tcPr>
         <w:shd w:val="clear" w:color="ffffff" w:themeColor="light1" w:fill="ffffff" w:themeFill="light1"/>
         <w:tcBorders>
-          <w:top w:val="none"/>
-          <w:left w:val="none"/>
+          <w:top w:val="none" w:color="000000" w:sz="4" w:space="0"/>
+          <w:left w:val="none" w:color="000000" w:sz="4" w:space="0"/>
           <w:bottom w:val="single" w:color="000000" w:themeColor="text1" w:themeTint="80" w:sz="4" w:space="0"/>
-          <w:right w:val="none"/>
+          <w:right w:val="none" w:color="000000" w:sz="4" w:space="0"/>
         </w:tcBorders>
       </w:tcPr>
     </w:tblStylePr>
@@ -14527,12 +14667,12 @@
         <w:tblBorders/>
       </w:tblPr>
       <w:tcPr>
-        <w:shd w:color="ffffff"/>
+        <w:shd w:val="clear" w:color="ffffff"/>
         <w:tcBorders>
-          <w:top w:val="none"/>
+          <w:top w:val="none" w:color="000000" w:sz="4" w:space="0"/>
           <w:left w:val="single" w:color="000000" w:themeColor="text1" w:themeTint="80" w:sz="4" w:space="0"/>
-          <w:bottom w:val="none"/>
-          <w:right w:val="none"/>
+          <w:bottom w:val="none" w:color="000000" w:sz="4" w:space="0"/>
+          <w:right w:val="none" w:color="000000" w:sz="4" w:space="0"/>
         </w:tcBorders>
       </w:tcPr>
     </w:tblStylePr>
@@ -14555,9 +14695,9 @@
         <w:shd w:val="clear" w:color="ffffff" w:themeColor="light1" w:fill="ffffff" w:themeFill="light1"/>
         <w:tcBorders>
           <w:top w:val="single" w:color="000000" w:themeColor="text1" w:themeTint="80" w:sz="4" w:space="0"/>
-          <w:left w:val="none"/>
-          <w:bottom w:val="none"/>
-          <w:right w:val="none"/>
+          <w:left w:val="none" w:color="000000" w:sz="4" w:space="0"/>
+          <w:bottom w:val="none" w:color="000000" w:sz="4" w:space="0"/>
+          <w:right w:val="none" w:color="000000" w:sz="4" w:space="0"/>
         </w:tcBorders>
       </w:tcPr>
     </w:tblStylePr>
@@ -14627,9 +14767,9 @@
       </w:tcPr>
     </w:tblStylePr>
   </w:style>
-  <w:style w:type="table" w:styleId="62">
+  <w:style w:type="table" w:styleId="768">
     <w:name w:val="Grid Table 7 Colorful - Accent 1"/>
-    <w:basedOn w:val="665"/>
+    <w:basedOn w:val="904"/>
     <w:uiPriority w:val="99"/>
     <w:pPr>
       <w:pBdr/>
@@ -14731,11 +14871,11 @@
         <w:tblBorders/>
       </w:tblPr>
       <w:tcPr>
-        <w:shd w:color="ffffff"/>
+        <w:shd w:val="clear" w:color="ffffff"/>
         <w:tcBorders>
-          <w:top w:val="none"/>
-          <w:left w:val="none"/>
-          <w:bottom w:val="none"/>
+          <w:top w:val="none" w:color="000000" w:sz="4" w:space="0"/>
+          <w:left w:val="none" w:color="000000" w:sz="4" w:space="0"/>
+          <w:bottom w:val="none" w:color="000000" w:sz="4" w:space="0"/>
           <w:right w:val="single" w:color="000000" w:themeColor="accent1" w:themeTint="80" w:sz="4" w:space="0"/>
         </w:tcBorders>
       </w:tcPr>
@@ -14758,10 +14898,10 @@
       <w:tcPr>
         <w:shd w:val="clear" w:color="ffffff" w:themeColor="light1" w:fill="ffffff" w:themeFill="light1"/>
         <w:tcBorders>
-          <w:top w:val="none"/>
-          <w:left w:val="none"/>
+          <w:top w:val="none" w:color="000000" w:sz="4" w:space="0"/>
+          <w:left w:val="none" w:color="000000" w:sz="4" w:space="0"/>
           <w:bottom w:val="single" w:color="000000" w:themeColor="accent1" w:themeTint="80" w:sz="4" w:space="0"/>
-          <w:right w:val="none"/>
+          <w:right w:val="none" w:color="000000" w:sz="4" w:space="0"/>
         </w:tcBorders>
       </w:tcPr>
     </w:tblStylePr>
@@ -14781,12 +14921,12 @@
         <w:tblBorders/>
       </w:tblPr>
       <w:tcPr>
-        <w:shd w:color="ffffff"/>
+        <w:shd w:val="clear" w:color="ffffff"/>
         <w:tcBorders>
-          <w:top w:val="none"/>
+          <w:top w:val="none" w:color="000000" w:sz="4" w:space="0"/>
           <w:left w:val="single" w:color="000000" w:themeColor="accent1" w:themeTint="80" w:sz="4" w:space="0"/>
-          <w:bottom w:val="none"/>
-          <w:right w:val="none"/>
+          <w:bottom w:val="none" w:color="000000" w:sz="4" w:space="0"/>
+          <w:right w:val="none" w:color="000000" w:sz="4" w:space="0"/>
         </w:tcBorders>
       </w:tcPr>
     </w:tblStylePr>
@@ -14809,9 +14949,9 @@
         <w:shd w:val="clear" w:color="ffffff" w:themeColor="light1" w:fill="ffffff" w:themeFill="light1"/>
         <w:tcBorders>
           <w:top w:val="single" w:color="000000" w:themeColor="accent1" w:themeTint="80" w:sz="4" w:space="0"/>
-          <w:left w:val="none"/>
-          <w:bottom w:val="none"/>
-          <w:right w:val="none"/>
+          <w:left w:val="none" w:color="000000" w:sz="4" w:space="0"/>
+          <w:bottom w:val="none" w:color="000000" w:sz="4" w:space="0"/>
+          <w:right w:val="none" w:color="000000" w:sz="4" w:space="0"/>
         </w:tcBorders>
       </w:tcPr>
     </w:tblStylePr>
@@ -14881,9 +15021,9 @@
       </w:tcPr>
     </w:tblStylePr>
   </w:style>
-  <w:style w:type="table" w:styleId="63">
+  <w:style w:type="table" w:styleId="769">
     <w:name w:val="Grid Table 7 Colorful - Accent 2"/>
-    <w:basedOn w:val="665"/>
+    <w:basedOn w:val="904"/>
     <w:uiPriority w:val="99"/>
     <w:pPr>
       <w:pBdr/>
@@ -14985,11 +15125,11 @@
         <w:tblBorders/>
       </w:tblPr>
       <w:tcPr>
-        <w:shd w:color="ffffff"/>
+        <w:shd w:val="clear" w:color="ffffff"/>
         <w:tcBorders>
-          <w:top w:val="none"/>
-          <w:left w:val="none"/>
-          <w:bottom w:val="none"/>
+          <w:top w:val="none" w:color="000000" w:sz="4" w:space="0"/>
+          <w:left w:val="none" w:color="000000" w:sz="4" w:space="0"/>
+          <w:bottom w:val="none" w:color="000000" w:sz="4" w:space="0"/>
           <w:right w:val="single" w:color="000000" w:themeColor="accent2" w:themeTint="97" w:sz="4" w:space="0"/>
         </w:tcBorders>
       </w:tcPr>
@@ -15012,10 +15152,10 @@
       <w:tcPr>
         <w:shd w:val="clear" w:color="ffffff" w:themeColor="light1" w:fill="ffffff" w:themeFill="light1"/>
         <w:tcBorders>
-          <w:top w:val="none"/>
-          <w:left w:val="none"/>
+          <w:top w:val="none" w:color="000000" w:sz="4" w:space="0"/>
+          <w:left w:val="none" w:color="000000" w:sz="4" w:space="0"/>
           <w:bottom w:val="single" w:color="000000" w:themeColor="accent2" w:themeTint="97" w:sz="4" w:space="0"/>
-          <w:right w:val="none"/>
+          <w:right w:val="none" w:color="000000" w:sz="4" w:space="0"/>
         </w:tcBorders>
       </w:tcPr>
     </w:tblStylePr>
@@ -15035,12 +15175,12 @@
         <w:tblBorders/>
       </w:tblPr>
       <w:tcPr>
-        <w:shd w:color="ffffff"/>
+        <w:shd w:val="clear" w:color="ffffff"/>
         <w:tcBorders>
-          <w:top w:val="none"/>
+          <w:top w:val="none" w:color="000000" w:sz="4" w:space="0"/>
           <w:left w:val="single" w:color="000000" w:themeColor="accent2" w:themeTint="97" w:sz="4" w:space="0"/>
-          <w:bottom w:val="none"/>
-          <w:right w:val="none"/>
+          <w:bottom w:val="none" w:color="000000" w:sz="4" w:space="0"/>
+          <w:right w:val="none" w:color="000000" w:sz="4" w:space="0"/>
         </w:tcBorders>
       </w:tcPr>
     </w:tblStylePr>
@@ -15063,9 +15203,9 @@
         <w:shd w:val="clear" w:color="ffffff" w:themeColor="light1" w:fill="ffffff" w:themeFill="light1"/>
         <w:tcBorders>
           <w:top w:val="single" w:color="000000" w:themeColor="accent2" w:themeTint="97" w:sz="4" w:space="0"/>
-          <w:left w:val="none"/>
-          <w:bottom w:val="none"/>
-          <w:right w:val="none"/>
+          <w:left w:val="none" w:color="000000" w:sz="4" w:space="0"/>
+          <w:bottom w:val="none" w:color="000000" w:sz="4" w:space="0"/>
+          <w:right w:val="none" w:color="000000" w:sz="4" w:space="0"/>
         </w:tcBorders>
       </w:tcPr>
     </w:tblStylePr>
@@ -15135,9 +15275,9 @@
       </w:tcPr>
     </w:tblStylePr>
   </w:style>
-  <w:style w:type="table" w:styleId="64">
+  <w:style w:type="table" w:styleId="770">
     <w:name w:val="Grid Table 7 Colorful - Accent 3"/>
-    <w:basedOn w:val="665"/>
+    <w:basedOn w:val="904"/>
     <w:uiPriority w:val="99"/>
     <w:pPr>
       <w:pBdr/>
@@ -15239,11 +15379,11 @@
         <w:tblBorders/>
       </w:tblPr>
       <w:tcPr>
-        <w:shd w:color="ffffff"/>
+        <w:shd w:val="clear" w:color="ffffff"/>
         <w:tcBorders>
-          <w:top w:val="none"/>
-          <w:left w:val="none"/>
-          <w:bottom w:val="none"/>
+          <w:top w:val="none" w:color="000000" w:sz="4" w:space="0"/>
+          <w:left w:val="none" w:color="000000" w:sz="4" w:space="0"/>
+          <w:bottom w:val="none" w:color="000000" w:sz="4" w:space="0"/>
           <w:right w:val="single" w:color="000000" w:themeColor="accent3" w:themeTint="FE" w:sz="4" w:space="0"/>
         </w:tcBorders>
       </w:tcPr>
@@ -15266,10 +15406,10 @@
       <w:tcPr>
         <w:shd w:val="clear" w:color="ffffff" w:themeColor="light1" w:fill="ffffff" w:themeFill="light1"/>
         <w:tcBorders>
-          <w:top w:val="none"/>
-          <w:left w:val="none"/>
+          <w:top w:val="none" w:color="000000" w:sz="4" w:space="0"/>
+          <w:left w:val="none" w:color="000000" w:sz="4" w:space="0"/>
           <w:bottom w:val="single" w:color="000000" w:themeColor="accent3" w:themeTint="FE" w:sz="4" w:space="0"/>
-          <w:right w:val="none"/>
+          <w:right w:val="none" w:color="000000" w:sz="4" w:space="0"/>
         </w:tcBorders>
       </w:tcPr>
     </w:tblStylePr>
@@ -15289,12 +15429,12 @@
         <w:tblBorders/>
       </w:tblPr>
       <w:tcPr>
-        <w:shd w:color="ffffff"/>
+        <w:shd w:val="clear" w:color="ffffff"/>
         <w:tcBorders>
-          <w:top w:val="none"/>
+          <w:top w:val="none" w:color="000000" w:sz="4" w:space="0"/>
           <w:left w:val="single" w:color="000000" w:themeColor="accent3" w:themeTint="FE" w:sz="4" w:space="0"/>
-          <w:bottom w:val="none"/>
-          <w:right w:val="none"/>
+          <w:bottom w:val="none" w:color="000000" w:sz="4" w:space="0"/>
+          <w:right w:val="none" w:color="000000" w:sz="4" w:space="0"/>
         </w:tcBorders>
       </w:tcPr>
     </w:tblStylePr>
@@ -15317,9 +15457,9 @@
         <w:shd w:val="clear" w:color="ffffff" w:themeColor="light1" w:fill="ffffff" w:themeFill="light1"/>
         <w:tcBorders>
           <w:top w:val="single" w:color="000000" w:themeColor="accent3" w:themeTint="FE" w:sz="4" w:space="0"/>
-          <w:left w:val="none"/>
-          <w:bottom w:val="none"/>
-          <w:right w:val="none"/>
+          <w:left w:val="none" w:color="000000" w:sz="4" w:space="0"/>
+          <w:bottom w:val="none" w:color="000000" w:sz="4" w:space="0"/>
+          <w:right w:val="none" w:color="000000" w:sz="4" w:space="0"/>
         </w:tcBorders>
       </w:tcPr>
     </w:tblStylePr>
@@ -15389,9 +15529,9 @@
       </w:tcPr>
     </w:tblStylePr>
   </w:style>
-  <w:style w:type="table" w:styleId="65">
+  <w:style w:type="table" w:styleId="771">
     <w:name w:val="Grid Table 7 Colorful - Accent 4"/>
-    <w:basedOn w:val="665"/>
+    <w:basedOn w:val="904"/>
     <w:uiPriority w:val="99"/>
     <w:pPr>
       <w:pBdr/>
@@ -15493,11 +15633,11 @@
         <w:tblBorders/>
       </w:tblPr>
       <w:tcPr>
-        <w:shd w:color="ffffff"/>
+        <w:shd w:val="clear" w:color="ffffff"/>
         <w:tcBorders>
-          <w:top w:val="none"/>
-          <w:left w:val="none"/>
-          <w:bottom w:val="none"/>
+          <w:top w:val="none" w:color="000000" w:sz="4" w:space="0"/>
+          <w:left w:val="none" w:color="000000" w:sz="4" w:space="0"/>
+          <w:bottom w:val="none" w:color="000000" w:sz="4" w:space="0"/>
           <w:right w:val="single" w:color="000000" w:themeColor="accent4" w:themeTint="9A" w:sz="4" w:space="0"/>
         </w:tcBorders>
       </w:tcPr>
@@ -15520,10 +15660,10 @@
       <w:tcPr>
         <w:shd w:val="clear" w:color="ffffff" w:themeColor="light1" w:fill="ffffff" w:themeFill="light1"/>
         <w:tcBorders>
-          <w:top w:val="none"/>
-          <w:left w:val="none"/>
+          <w:top w:val="none" w:color="000000" w:sz="4" w:space="0"/>
+          <w:left w:val="none" w:color="000000" w:sz="4" w:space="0"/>
           <w:bottom w:val="single" w:color="000000" w:themeColor="accent4" w:themeTint="9A" w:sz="4" w:space="0"/>
-          <w:right w:val="none"/>
+          <w:right w:val="none" w:color="000000" w:sz="4" w:space="0"/>
         </w:tcBorders>
       </w:tcPr>
     </w:tblStylePr>
@@ -15543,12 +15683,12 @@
         <w:tblBorders/>
       </w:tblPr>
       <w:tcPr>
-        <w:shd w:color="ffffff"/>
+        <w:shd w:val="clear" w:color="ffffff"/>
         <w:tcBorders>
-          <w:top w:val="none"/>
+          <w:top w:val="none" w:color="000000" w:sz="4" w:space="0"/>
           <w:left w:val="single" w:color="000000" w:themeColor="accent4" w:themeTint="9A" w:sz="4" w:space="0"/>
-          <w:bottom w:val="none"/>
-          <w:right w:val="none"/>
+          <w:bottom w:val="none" w:color="000000" w:sz="4" w:space="0"/>
+          <w:right w:val="none" w:color="000000" w:sz="4" w:space="0"/>
         </w:tcBorders>
       </w:tcPr>
     </w:tblStylePr>
@@ -15571,9 +15711,9 @@
         <w:shd w:val="clear" w:color="ffffff" w:themeColor="light1" w:fill="ffffff" w:themeFill="light1"/>
         <w:tcBorders>
           <w:top w:val="single" w:color="000000" w:themeColor="accent4" w:themeTint="9A" w:sz="4" w:space="0"/>
-          <w:left w:val="none"/>
-          <w:bottom w:val="none"/>
-          <w:right w:val="none"/>
+          <w:left w:val="none" w:color="000000" w:sz="4" w:space="0"/>
+          <w:bottom w:val="none" w:color="000000" w:sz="4" w:space="0"/>
+          <w:right w:val="none" w:color="000000" w:sz="4" w:space="0"/>
         </w:tcBorders>
       </w:tcPr>
     </w:tblStylePr>
@@ -15643,9 +15783,9 @@
       </w:tcPr>
     </w:tblStylePr>
   </w:style>
-  <w:style w:type="table" w:styleId="66">
+  <w:style w:type="table" w:styleId="772">
     <w:name w:val="Grid Table 7 Colorful - Accent 5"/>
-    <w:basedOn w:val="665"/>
+    <w:basedOn w:val="904"/>
     <w:uiPriority w:val="99"/>
     <w:pPr>
       <w:pBdr/>
@@ -15747,11 +15887,11 @@
         <w:tblBorders/>
       </w:tblPr>
       <w:tcPr>
-        <w:shd w:color="ffffff"/>
+        <w:shd w:val="clear" w:color="ffffff"/>
         <w:tcBorders>
-          <w:top w:val="none"/>
-          <w:left w:val="none"/>
-          <w:bottom w:val="none"/>
+          <w:top w:val="none" w:color="000000" w:sz="4" w:space="0"/>
+          <w:left w:val="none" w:color="000000" w:sz="4" w:space="0"/>
+          <w:bottom w:val="none" w:color="000000" w:sz="4" w:space="0"/>
           <w:right w:val="single" w:color="000000" w:themeColor="accent5" w:themeTint="90" w:sz="4" w:space="0"/>
         </w:tcBorders>
       </w:tcPr>
@@ -15774,10 +15914,10 @@
       <w:tcPr>
         <w:shd w:val="clear" w:color="ffffff" w:themeColor="light1" w:fill="ffffff" w:themeFill="light1"/>
         <w:tcBorders>
-          <w:top w:val="none"/>
-          <w:left w:val="none"/>
+          <w:top w:val="none" w:color="000000" w:sz="4" w:space="0"/>
+          <w:left w:val="none" w:color="000000" w:sz="4" w:space="0"/>
           <w:bottom w:val="single" w:color="000000" w:themeColor="accent5" w:themeTint="90" w:sz="4" w:space="0"/>
-          <w:right w:val="none"/>
+          <w:right w:val="none" w:color="000000" w:sz="4" w:space="0"/>
         </w:tcBorders>
       </w:tcPr>
     </w:tblStylePr>
@@ -15797,12 +15937,12 @@
         <w:tblBorders/>
       </w:tblPr>
       <w:tcPr>
-        <w:shd w:color="ffffff"/>
+        <w:shd w:val="clear" w:color="ffffff"/>
         <w:tcBorders>
-          <w:top w:val="none"/>
+          <w:top w:val="none" w:color="000000" w:sz="4" w:space="0"/>
           <w:left w:val="single" w:color="000000" w:themeColor="accent5" w:themeTint="90" w:sz="4" w:space="0"/>
-          <w:bottom w:val="none"/>
-          <w:right w:val="none"/>
+          <w:bottom w:val="none" w:color="000000" w:sz="4" w:space="0"/>
+          <w:right w:val="none" w:color="000000" w:sz="4" w:space="0"/>
         </w:tcBorders>
       </w:tcPr>
     </w:tblStylePr>
@@ -15825,9 +15965,9 @@
         <w:shd w:val="clear" w:color="ffffff" w:themeColor="light1" w:fill="ffffff" w:themeFill="light1"/>
         <w:tcBorders>
           <w:top w:val="single" w:color="000000" w:themeColor="accent5" w:themeTint="90" w:sz="4" w:space="0"/>
-          <w:left w:val="none"/>
-          <w:bottom w:val="none"/>
-          <w:right w:val="none"/>
+          <w:left w:val="none" w:color="000000" w:sz="4" w:space="0"/>
+          <w:bottom w:val="none" w:color="000000" w:sz="4" w:space="0"/>
+          <w:right w:val="none" w:color="000000" w:sz="4" w:space="0"/>
         </w:tcBorders>
       </w:tcPr>
     </w:tblStylePr>
@@ -15897,9 +16037,9 @@
       </w:tcPr>
     </w:tblStylePr>
   </w:style>
-  <w:style w:type="table" w:styleId="67">
+  <w:style w:type="table" w:styleId="773">
     <w:name w:val="Grid Table 7 Colorful - Accent 6"/>
-    <w:basedOn w:val="665"/>
+    <w:basedOn w:val="904"/>
     <w:uiPriority w:val="99"/>
     <w:pPr>
       <w:pBdr/>
@@ -16001,11 +16141,11 @@
         <w:tblBorders/>
       </w:tblPr>
       <w:tcPr>
-        <w:shd w:color="ffffff"/>
+        <w:shd w:val="clear" w:color="ffffff"/>
         <w:tcBorders>
-          <w:top w:val="none"/>
-          <w:left w:val="none"/>
-          <w:bottom w:val="none"/>
+          <w:top w:val="none" w:color="000000" w:sz="4" w:space="0"/>
+          <w:left w:val="none" w:color="000000" w:sz="4" w:space="0"/>
+          <w:bottom w:val="none" w:color="000000" w:sz="4" w:space="0"/>
           <w:right w:val="single" w:color="000000" w:themeColor="accent6" w:themeTint="90" w:sz="4" w:space="0"/>
         </w:tcBorders>
       </w:tcPr>
@@ -16028,10 +16168,10 @@
       <w:tcPr>
         <w:shd w:val="clear" w:color="ffffff" w:themeColor="light1" w:fill="ffffff" w:themeFill="light1"/>
         <w:tcBorders>
-          <w:top w:val="none"/>
-          <w:left w:val="none"/>
+          <w:top w:val="none" w:color="000000" w:sz="4" w:space="0"/>
+          <w:left w:val="none" w:color="000000" w:sz="4" w:space="0"/>
           <w:bottom w:val="single" w:color="000000" w:themeColor="accent6" w:themeTint="90" w:sz="4" w:space="0"/>
-          <w:right w:val="none"/>
+          <w:right w:val="none" w:color="000000" w:sz="4" w:space="0"/>
         </w:tcBorders>
       </w:tcPr>
     </w:tblStylePr>
@@ -16051,12 +16191,12 @@
         <w:tblBorders/>
       </w:tblPr>
       <w:tcPr>
-        <w:shd w:color="ffffff"/>
+        <w:shd w:val="clear" w:color="ffffff"/>
         <w:tcBorders>
-          <w:top w:val="none"/>
+          <w:top w:val="none" w:color="000000" w:sz="4" w:space="0"/>
           <w:left w:val="single" w:color="000000" w:themeColor="accent6" w:themeTint="90" w:sz="4" w:space="0"/>
-          <w:bottom w:val="none"/>
-          <w:right w:val="none"/>
+          <w:bottom w:val="none" w:color="000000" w:sz="4" w:space="0"/>
+          <w:right w:val="none" w:color="000000" w:sz="4" w:space="0"/>
         </w:tcBorders>
       </w:tcPr>
     </w:tblStylePr>
@@ -16079,9 +16219,9 @@
         <w:shd w:val="clear" w:color="ffffff" w:themeColor="light1" w:fill="ffffff" w:themeFill="light1"/>
         <w:tcBorders>
           <w:top w:val="single" w:color="000000" w:themeColor="accent6" w:themeTint="90" w:sz="4" w:space="0"/>
-          <w:left w:val="none"/>
-          <w:bottom w:val="none"/>
-          <w:right w:val="none"/>
+          <w:left w:val="none" w:color="000000" w:sz="4" w:space="0"/>
+          <w:bottom w:val="none" w:color="000000" w:sz="4" w:space="0"/>
+          <w:right w:val="none" w:color="000000" w:sz="4" w:space="0"/>
         </w:tcBorders>
       </w:tcPr>
     </w:tblStylePr>
@@ -16151,9 +16291,9 @@
       </w:tcPr>
     </w:tblStylePr>
   </w:style>
-  <w:style w:type="table" w:styleId="68">
+  <w:style w:type="table" w:styleId="774">
     <w:name w:val="List Table 1 Light"/>
-    <w:basedOn w:val="665"/>
+    <w:basedOn w:val="904"/>
     <w:uiPriority w:val="99"/>
     <w:pPr>
       <w:pBdr/>
@@ -16367,9 +16507,9 @@
       </w:tcPr>
     </w:tblStylePr>
   </w:style>
-  <w:style w:type="table" w:styleId="69">
+  <w:style w:type="table" w:styleId="775">
     <w:name w:val="List Table 1 Light - Accent 1"/>
-    <w:basedOn w:val="665"/>
+    <w:basedOn w:val="904"/>
     <w:uiPriority w:val="99"/>
     <w:pPr>
       <w:pBdr/>
@@ -16583,9 +16723,9 @@
       </w:tcPr>
     </w:tblStylePr>
   </w:style>
-  <w:style w:type="table" w:styleId="70">
+  <w:style w:type="table" w:styleId="776">
     <w:name w:val="List Table 1 Light - Accent 2"/>
-    <w:basedOn w:val="665"/>
+    <w:basedOn w:val="904"/>
     <w:uiPriority w:val="99"/>
     <w:pPr>
       <w:pBdr/>
@@ -16799,9 +16939,9 @@
       </w:tcPr>
     </w:tblStylePr>
   </w:style>
-  <w:style w:type="table" w:styleId="71">
+  <w:style w:type="table" w:styleId="777">
     <w:name w:val="List Table 1 Light - Accent 3"/>
-    <w:basedOn w:val="665"/>
+    <w:basedOn w:val="904"/>
     <w:uiPriority w:val="99"/>
     <w:pPr>
       <w:pBdr/>
@@ -17015,9 +17155,9 @@
       </w:tcPr>
     </w:tblStylePr>
   </w:style>
-  <w:style w:type="table" w:styleId="72">
+  <w:style w:type="table" w:styleId="778">
     <w:name w:val="List Table 1 Light - Accent 4"/>
-    <w:basedOn w:val="665"/>
+    <w:basedOn w:val="904"/>
     <w:uiPriority w:val="99"/>
     <w:pPr>
       <w:pBdr/>
@@ -17231,9 +17371,9 @@
       </w:tcPr>
     </w:tblStylePr>
   </w:style>
-  <w:style w:type="table" w:styleId="73">
+  <w:style w:type="table" w:styleId="779">
     <w:name w:val="List Table 1 Light - Accent 5"/>
-    <w:basedOn w:val="665"/>
+    <w:basedOn w:val="904"/>
     <w:uiPriority w:val="99"/>
     <w:pPr>
       <w:pBdr/>
@@ -17447,9 +17587,9 @@
       </w:tcPr>
     </w:tblStylePr>
   </w:style>
-  <w:style w:type="table" w:styleId="74">
+  <w:style w:type="table" w:styleId="780">
     <w:name w:val="List Table 1 Light - Accent 6"/>
-    <w:basedOn w:val="665"/>
+    <w:basedOn w:val="904"/>
     <w:uiPriority w:val="99"/>
     <w:pPr>
       <w:pBdr/>
@@ -17663,9 +17803,9 @@
       </w:tcPr>
     </w:tblStylePr>
   </w:style>
-  <w:style w:type="table" w:styleId="75">
+  <w:style w:type="table" w:styleId="781">
     <w:name w:val="List Table 2"/>
-    <w:basedOn w:val="665"/>
+    <w:basedOn w:val="904"/>
     <w:uiPriority w:val="99"/>
     <w:pPr>
       <w:pBdr/>
@@ -17901,9 +18041,9 @@
       </w:tcPr>
     </w:tblStylePr>
   </w:style>
-  <w:style w:type="table" w:styleId="76">
+  <w:style w:type="table" w:styleId="782">
     <w:name w:val="List Table 2 - Accent 1"/>
-    <w:basedOn w:val="665"/>
+    <w:basedOn w:val="904"/>
     <w:uiPriority w:val="99"/>
     <w:pPr>
       <w:pBdr/>
@@ -18139,9 +18279,9 @@
       </w:tcPr>
     </w:tblStylePr>
   </w:style>
-  <w:style w:type="table" w:styleId="77">
+  <w:style w:type="table" w:styleId="783">
     <w:name w:val="List Table 2 - Accent 2"/>
-    <w:basedOn w:val="665"/>
+    <w:basedOn w:val="904"/>
     <w:uiPriority w:val="99"/>
     <w:pPr>
       <w:pBdr/>
@@ -18377,9 +18517,9 @@
       </w:tcPr>
     </w:tblStylePr>
   </w:style>
-  <w:style w:type="table" w:styleId="78">
+  <w:style w:type="table" w:styleId="784">
     <w:name w:val="List Table 2 - Accent 3"/>
-    <w:basedOn w:val="665"/>
+    <w:basedOn w:val="904"/>
     <w:uiPriority w:val="99"/>
     <w:pPr>
       <w:pBdr/>
@@ -18615,9 +18755,9 @@
       </w:tcPr>
     </w:tblStylePr>
   </w:style>
-  <w:style w:type="table" w:styleId="79">
+  <w:style w:type="table" w:styleId="785">
     <w:name w:val="List Table 2 - Accent 4"/>
-    <w:basedOn w:val="665"/>
+    <w:basedOn w:val="904"/>
     <w:uiPriority w:val="99"/>
     <w:pPr>
       <w:pBdr/>
@@ -18853,9 +18993,9 @@
       </w:tcPr>
     </w:tblStylePr>
   </w:style>
-  <w:style w:type="table" w:styleId="80">
+  <w:style w:type="table" w:styleId="786">
     <w:name w:val="List Table 2 - Accent 5"/>
-    <w:basedOn w:val="665"/>
+    <w:basedOn w:val="904"/>
     <w:uiPriority w:val="99"/>
     <w:pPr>
       <w:pBdr/>
@@ -19091,9 +19231,9 @@
       </w:tcPr>
     </w:tblStylePr>
   </w:style>
-  <w:style w:type="table" w:styleId="81">
+  <w:style w:type="table" w:styleId="787">
     <w:name w:val="List Table 2 - Accent 6"/>
-    <w:basedOn w:val="665"/>
+    <w:basedOn w:val="904"/>
     <w:uiPriority w:val="99"/>
     <w:pPr>
       <w:pBdr/>
@@ -19329,9 +19469,9 @@
       </w:tcPr>
     </w:tblStylePr>
   </w:style>
-  <w:style w:type="table" w:styleId="82">
+  <w:style w:type="table" w:styleId="788">
     <w:name w:val="List Table 3"/>
-    <w:basedOn w:val="665"/>
+    <w:basedOn w:val="904"/>
     <w:uiPriority w:val="99"/>
     <w:pPr>
       <w:pBdr/>
@@ -19557,9 +19697,9 @@
       </w:tcPr>
     </w:tblStylePr>
   </w:style>
-  <w:style w:type="table" w:styleId="83">
+  <w:style w:type="table" w:styleId="789">
     <w:name w:val="List Table 3 - Accent 1"/>
-    <w:basedOn w:val="665"/>
+    <w:basedOn w:val="904"/>
     <w:uiPriority w:val="99"/>
     <w:pPr>
       <w:pBdr/>
@@ -19785,9 +19925,9 @@
       </w:tcPr>
     </w:tblStylePr>
   </w:style>
-  <w:style w:type="table" w:styleId="84">
+  <w:style w:type="table" w:styleId="790">
     <w:name w:val="List Table 3 - Accent 2"/>
-    <w:basedOn w:val="665"/>
+    <w:basedOn w:val="904"/>
     <w:uiPriority w:val="99"/>
     <w:pPr>
       <w:pBdr/>
@@ -20013,9 +20153,9 @@
       </w:tcPr>
     </w:tblStylePr>
   </w:style>
-  <w:style w:type="table" w:styleId="85">
+  <w:style w:type="table" w:styleId="791">
     <w:name w:val="List Table 3 - Accent 3"/>
-    <w:basedOn w:val="665"/>
+    <w:basedOn w:val="904"/>
     <w:uiPriority w:val="99"/>
     <w:pPr>
       <w:pBdr/>
@@ -20241,9 +20381,9 @@
       </w:tcPr>
     </w:tblStylePr>
   </w:style>
-  <w:style w:type="table" w:styleId="86">
+  <w:style w:type="table" w:styleId="792">
     <w:name w:val="List Table 3 - Accent 4"/>
-    <w:basedOn w:val="665"/>
+    <w:basedOn w:val="904"/>
     <w:uiPriority w:val="99"/>
     <w:pPr>
       <w:pBdr/>
@@ -20469,9 +20609,9 @@
       </w:tcPr>
     </w:tblStylePr>
   </w:style>
-  <w:style w:type="table" w:styleId="87">
+  <w:style w:type="table" w:styleId="793">
     <w:name w:val="List Table 3 - Accent 5"/>
-    <w:basedOn w:val="665"/>
+    <w:basedOn w:val="904"/>
     <w:uiPriority w:val="99"/>
     <w:pPr>
       <w:pBdr/>
@@ -20697,9 +20837,9 @@
       </w:tcPr>
     </w:tblStylePr>
   </w:style>
-  <w:style w:type="table" w:styleId="88">
+  <w:style w:type="table" w:styleId="794">
     <w:name w:val="List Table 3 - Accent 6"/>
-    <w:basedOn w:val="665"/>
+    <w:basedOn w:val="904"/>
     <w:uiPriority w:val="99"/>
     <w:pPr>
       <w:pBdr/>
@@ -20925,9 +21065,9 @@
       </w:tcPr>
     </w:tblStylePr>
   </w:style>
-  <w:style w:type="table" w:styleId="89">
+  <w:style w:type="table" w:styleId="795">
     <w:name w:val="List Table 4"/>
-    <w:basedOn w:val="665"/>
+    <w:basedOn w:val="904"/>
     <w:uiPriority w:val="99"/>
     <w:pPr>
       <w:pBdr/>
@@ -21150,9 +21290,9 @@
       </w:tcPr>
     </w:tblStylePr>
   </w:style>
-  <w:style w:type="table" w:styleId="90">
+  <w:style w:type="table" w:styleId="796">
     <w:name w:val="List Table 4 - Accent 1"/>
-    <w:basedOn w:val="665"/>
+    <w:basedOn w:val="904"/>
     <w:uiPriority w:val="99"/>
     <w:pPr>
       <w:pBdr/>
@@ -21375,9 +21515,9 @@
       </w:tcPr>
     </w:tblStylePr>
   </w:style>
-  <w:style w:type="table" w:styleId="91">
+  <w:style w:type="table" w:styleId="797">
     <w:name w:val="List Table 4 - Accent 2"/>
-    <w:basedOn w:val="665"/>
+    <w:basedOn w:val="904"/>
     <w:uiPriority w:val="99"/>
     <w:pPr>
       <w:pBdr/>
@@ -21600,9 +21740,9 @@
       </w:tcPr>
     </w:tblStylePr>
   </w:style>
-  <w:style w:type="table" w:styleId="92">
+  <w:style w:type="table" w:styleId="798">
     <w:name w:val="List Table 4 - Accent 3"/>
-    <w:basedOn w:val="665"/>
+    <w:basedOn w:val="904"/>
     <w:uiPriority w:val="99"/>
     <w:pPr>
       <w:pBdr/>
@@ -21825,9 +21965,9 @@
       </w:tcPr>
     </w:tblStylePr>
   </w:style>
-  <w:style w:type="table" w:styleId="93">
+  <w:style w:type="table" w:styleId="799">
     <w:name w:val="List Table 4 - Accent 4"/>
-    <w:basedOn w:val="665"/>
+    <w:basedOn w:val="904"/>
     <w:uiPriority w:val="99"/>
     <w:pPr>
       <w:pBdr/>
@@ -22050,9 +22190,9 @@
       </w:tcPr>
     </w:tblStylePr>
   </w:style>
-  <w:style w:type="table" w:styleId="94">
+  <w:style w:type="table" w:styleId="800">
     <w:name w:val="List Table 4 - Accent 5"/>
-    <w:basedOn w:val="665"/>
+    <w:basedOn w:val="904"/>
     <w:uiPriority w:val="99"/>
     <w:pPr>
       <w:pBdr/>
@@ -22275,9 +22415,9 @@
       </w:tcPr>
     </w:tblStylePr>
   </w:style>
-  <w:style w:type="table" w:styleId="95">
+  <w:style w:type="table" w:styleId="801">
     <w:name w:val="List Table 4 - Accent 6"/>
-    <w:basedOn w:val="665"/>
+    <w:basedOn w:val="904"/>
     <w:uiPriority w:val="99"/>
     <w:pPr>
       <w:pBdr/>
@@ -22500,9 +22640,9 @@
       </w:tcPr>
     </w:tblStylePr>
   </w:style>
-  <w:style w:type="table" w:styleId="96">
+  <w:style w:type="table" w:styleId="802">
     <w:name w:val="List Table 5 Dark"/>
-    <w:basedOn w:val="665"/>
+    <w:basedOn w:val="904"/>
     <w:uiPriority w:val="99"/>
     <w:pPr>
       <w:pBdr/>
@@ -22742,9 +22882,9 @@
       </w:tcPr>
     </w:tblStylePr>
   </w:style>
-  <w:style w:type="table" w:styleId="97">
+  <w:style w:type="table" w:styleId="803">
     <w:name w:val="List Table 5 Dark - Accent 1"/>
-    <w:basedOn w:val="665"/>
+    <w:basedOn w:val="904"/>
     <w:uiPriority w:val="99"/>
     <w:pPr>
       <w:pBdr/>
@@ -22984,9 +23124,9 @@
       </w:tcPr>
     </w:tblStylePr>
   </w:style>
-  <w:style w:type="table" w:styleId="98">
+  <w:style w:type="table" w:styleId="804">
     <w:name w:val="List Table 5 Dark - Accent 2"/>
-    <w:basedOn w:val="665"/>
+    <w:basedOn w:val="904"/>
     <w:uiPriority w:val="99"/>
     <w:pPr>
       <w:pBdr/>
@@ -23226,9 +23366,9 @@
       </w:tcPr>
     </w:tblStylePr>
   </w:style>
-  <w:style w:type="table" w:styleId="99">
+  <w:style w:type="table" w:styleId="805">
     <w:name w:val="List Table 5 Dark - Accent 3"/>
-    <w:basedOn w:val="665"/>
+    <w:basedOn w:val="904"/>
     <w:uiPriority w:val="99"/>
     <w:pPr>
       <w:pBdr/>
@@ -23468,9 +23608,9 @@
       </w:tcPr>
     </w:tblStylePr>
   </w:style>
-  <w:style w:type="table" w:styleId="100">
+  <w:style w:type="table" w:styleId="806">
     <w:name w:val="List Table 5 Dark - Accent 4"/>
-    <w:basedOn w:val="665"/>
+    <w:basedOn w:val="904"/>
     <w:uiPriority w:val="99"/>
     <w:pPr>
       <w:pBdr/>
@@ -23710,9 +23850,9 @@
       </w:tcPr>
     </w:tblStylePr>
   </w:style>
-  <w:style w:type="table" w:styleId="101">
+  <w:style w:type="table" w:styleId="807">
     <w:name w:val="List Table 5 Dark - Accent 5"/>
-    <w:basedOn w:val="665"/>
+    <w:basedOn w:val="904"/>
     <w:uiPriority w:val="99"/>
     <w:pPr>
       <w:pBdr/>
@@ -23952,9 +24092,9 @@
       </w:tcPr>
     </w:tblStylePr>
   </w:style>
-  <w:style w:type="table" w:styleId="102">
+  <w:style w:type="table" w:styleId="808">
     <w:name w:val="List Table 5 Dark - Accent 6"/>
-    <w:basedOn w:val="665"/>
+    <w:basedOn w:val="904"/>
     <w:uiPriority w:val="99"/>
     <w:pPr>
       <w:pBdr/>
@@ -24194,9 +24334,9 @@
       </w:tcPr>
     </w:tblStylePr>
   </w:style>
-  <w:style w:type="table" w:styleId="103">
+  <w:style w:type="table" w:styleId="809">
     <w:name w:val="List Table 6 Colorful"/>
-    <w:basedOn w:val="665"/>
+    <w:basedOn w:val="904"/>
     <w:uiPriority w:val="99"/>
     <w:pPr>
       <w:pBdr/>
@@ -24417,9 +24557,9 @@
       </w:tcPr>
     </w:tblStylePr>
   </w:style>
-  <w:style w:type="table" w:styleId="104">
+  <w:style w:type="table" w:styleId="810">
     <w:name w:val="List Table 6 Colorful - Accent 1"/>
-    <w:basedOn w:val="665"/>
+    <w:basedOn w:val="904"/>
     <w:uiPriority w:val="99"/>
     <w:pPr>
       <w:pBdr/>
@@ -24640,9 +24780,9 @@
       </w:tcPr>
     </w:tblStylePr>
   </w:style>
-  <w:style w:type="table" w:styleId="105">
+  <w:style w:type="table" w:styleId="811">
     <w:name w:val="List Table 6 Colorful - Accent 2"/>
-    <w:basedOn w:val="665"/>
+    <w:basedOn w:val="904"/>
     <w:uiPriority w:val="99"/>
     <w:pPr>
       <w:pBdr/>
@@ -24863,9 +25003,9 @@
       </w:tcPr>
     </w:tblStylePr>
   </w:style>
-  <w:style w:type="table" w:styleId="106">
+  <w:style w:type="table" w:styleId="812">
     <w:name w:val="List Table 6 Colorful - Accent 3"/>
-    <w:basedOn w:val="665"/>
+    <w:basedOn w:val="904"/>
     <w:uiPriority w:val="99"/>
     <w:pPr>
       <w:pBdr/>
@@ -25086,9 +25226,9 @@
       </w:tcPr>
     </w:tblStylePr>
   </w:style>
-  <w:style w:type="table" w:styleId="107">
+  <w:style w:type="table" w:styleId="813">
     <w:name w:val="List Table 6 Colorful - Accent 4"/>
-    <w:basedOn w:val="665"/>
+    <w:basedOn w:val="904"/>
     <w:uiPriority w:val="99"/>
     <w:pPr>
       <w:pBdr/>
@@ -25309,9 +25449,9 @@
       </w:tcPr>
     </w:tblStylePr>
   </w:style>
-  <w:style w:type="table" w:styleId="108">
+  <w:style w:type="table" w:styleId="814">
     <w:name w:val="List Table 6 Colorful - Accent 5"/>
-    <w:basedOn w:val="665"/>
+    <w:basedOn w:val="904"/>
     <w:uiPriority w:val="99"/>
     <w:pPr>
       <w:pBdr/>
@@ -25532,9 +25672,9 @@
       </w:tcPr>
     </w:tblStylePr>
   </w:style>
-  <w:style w:type="table" w:styleId="109">
+  <w:style w:type="table" w:styleId="815">
     <w:name w:val="List Table 6 Colorful - Accent 6"/>
-    <w:basedOn w:val="665"/>
+    <w:basedOn w:val="904"/>
     <w:uiPriority w:val="99"/>
     <w:pPr>
       <w:pBdr/>
@@ -25755,9 +25895,9 @@
       </w:tcPr>
     </w:tblStylePr>
   </w:style>
-  <w:style w:type="table" w:styleId="110">
+  <w:style w:type="table" w:styleId="816">
     <w:name w:val="List Table 7 Colorful"/>
-    <w:basedOn w:val="665"/>
+    <w:basedOn w:val="904"/>
     <w:uiPriority w:val="99"/>
     <w:pPr>
       <w:pBdr/>
@@ -25856,11 +25996,11 @@
         <w:tblBorders/>
       </w:tblPr>
       <w:tcPr>
-        <w:shd w:color="ffffff"/>
+        <w:shd w:val="clear" w:color="ffffff"/>
         <w:tcBorders>
-          <w:top w:val="none"/>
-          <w:left w:val="none"/>
-          <w:bottom w:val="none"/>
+          <w:top w:val="none" w:color="000000" w:sz="4" w:space="0"/>
+          <w:left w:val="none" w:color="000000" w:sz="4" w:space="0"/>
+          <w:bottom w:val="none" w:color="000000" w:sz="4" w:space="0"/>
           <w:right w:val="single" w:color="000000" w:themeColor="text1" w:themeTint="80" w:sz="4" w:space="0"/>
         </w:tcBorders>
       </w:tcPr>
@@ -25883,10 +26023,10 @@
       <w:tcPr>
         <w:shd w:val="clear" w:color="ffffff" w:themeColor="light1" w:fill="ffffff" w:themeFill="light1"/>
         <w:tcBorders>
-          <w:top w:val="none"/>
-          <w:left w:val="none"/>
+          <w:top w:val="none" w:color="000000" w:sz="4" w:space="0"/>
+          <w:left w:val="none" w:color="000000" w:sz="4" w:space="0"/>
           <w:bottom w:val="single" w:color="000000" w:themeColor="text1" w:themeTint="80" w:sz="4" w:space="0"/>
-          <w:right w:val="none"/>
+          <w:right w:val="none" w:color="000000" w:sz="4" w:space="0"/>
         </w:tcBorders>
       </w:tcPr>
     </w:tblStylePr>
@@ -25906,12 +26046,12 @@
         <w:tblBorders/>
       </w:tblPr>
       <w:tcPr>
-        <w:shd w:color="ffffff"/>
+        <w:shd w:val="clear" w:color="ffffff"/>
         <w:tcBorders>
-          <w:top w:val="none"/>
+          <w:top w:val="none" w:color="000000" w:sz="4" w:space="0"/>
           <w:left w:val="single" w:color="000000" w:themeColor="text1" w:themeTint="80" w:sz="4" w:space="0"/>
-          <w:bottom w:val="none"/>
-          <w:right w:val="none"/>
+          <w:bottom w:val="none" w:color="000000" w:sz="4" w:space="0"/>
+          <w:right w:val="none" w:color="000000" w:sz="4" w:space="0"/>
         </w:tcBorders>
       </w:tcPr>
     </w:tblStylePr>
@@ -25934,9 +26074,9 @@
         <w:shd w:val="clear" w:color="ffffff" w:themeColor="light1" w:fill="ffffff" w:themeFill="light1"/>
         <w:tcBorders>
           <w:top w:val="single" w:color="000000" w:themeColor="text1" w:themeTint="80" w:sz="4" w:space="0"/>
-          <w:left w:val="none"/>
-          <w:bottom w:val="none"/>
-          <w:right w:val="none"/>
+          <w:left w:val="none" w:color="000000" w:sz="4" w:space="0"/>
+          <w:bottom w:val="none" w:color="000000" w:sz="4" w:space="0"/>
+          <w:right w:val="none" w:color="000000" w:sz="4" w:space="0"/>
         </w:tcBorders>
       </w:tcPr>
     </w:tblStylePr>
@@ -26011,9 +26151,9 @@
       </w:tcPr>
     </w:tblStylePr>
   </w:style>
-  <w:style w:type="table" w:styleId="111">
+  <w:style w:type="table" w:styleId="817">
     <w:name w:val="List Table 7 Colorful - Accent 1"/>
-    <w:basedOn w:val="665"/>
+    <w:basedOn w:val="904"/>
     <w:uiPriority w:val="99"/>
     <w:pPr>
       <w:pBdr/>
@@ -26112,11 +26252,11 @@
         <w:tblBorders/>
       </w:tblPr>
       <w:tcPr>
-        <w:shd w:color="ffffff"/>
+        <w:shd w:val="clear" w:color="ffffff"/>
         <w:tcBorders>
-          <w:top w:val="none"/>
-          <w:left w:val="none"/>
-          <w:bottom w:val="none"/>
+          <w:top w:val="none" w:color="000000" w:sz="4" w:space="0"/>
+          <w:left w:val="none" w:color="000000" w:sz="4" w:space="0"/>
+          <w:bottom w:val="none" w:color="000000" w:sz="4" w:space="0"/>
           <w:right w:val="single" w:color="000000" w:themeColor="accent1" w:sz="4" w:space="0"/>
         </w:tcBorders>
       </w:tcPr>
@@ -26139,10 +26279,10 @@
       <w:tcPr>
         <w:shd w:val="clear" w:color="ffffff" w:themeColor="light1" w:fill="ffffff" w:themeFill="light1"/>
         <w:tcBorders>
-          <w:top w:val="none"/>
-          <w:left w:val="none"/>
+          <w:top w:val="none" w:color="000000" w:sz="4" w:space="0"/>
+          <w:left w:val="none" w:color="000000" w:sz="4" w:space="0"/>
           <w:bottom w:val="single" w:color="000000" w:themeColor="accent1" w:sz="4" w:space="0"/>
-          <w:right w:val="none"/>
+          <w:right w:val="none" w:color="000000" w:sz="4" w:space="0"/>
         </w:tcBorders>
       </w:tcPr>
     </w:tblStylePr>
@@ -26162,12 +26302,12 @@
         <w:tblBorders/>
       </w:tblPr>
       <w:tcPr>
-        <w:shd w:color="ffffff"/>
+        <w:shd w:val="clear" w:color="ffffff"/>
         <w:tcBorders>
-          <w:top w:val="none"/>
+          <w:top w:val="none" w:color="000000" w:sz="4" w:space="0"/>
           <w:left w:val="single" w:color="000000" w:themeColor="accent1" w:sz="4" w:space="0"/>
-          <w:bottom w:val="none"/>
-          <w:right w:val="none"/>
+          <w:bottom w:val="none" w:color="000000" w:sz="4" w:space="0"/>
+          <w:right w:val="none" w:color="000000" w:sz="4" w:space="0"/>
         </w:tcBorders>
       </w:tcPr>
     </w:tblStylePr>
@@ -26190,9 +26330,9 @@
         <w:shd w:val="clear" w:color="ffffff" w:themeColor="light1" w:fill="ffffff" w:themeFill="light1"/>
         <w:tcBorders>
           <w:top w:val="single" w:color="000000" w:themeColor="accent1" w:sz="4" w:space="0"/>
-          <w:left w:val="none"/>
-          <w:bottom w:val="none"/>
-          <w:right w:val="none"/>
+          <w:left w:val="none" w:color="000000" w:sz="4" w:space="0"/>
+          <w:bottom w:val="none" w:color="000000" w:sz="4" w:space="0"/>
+          <w:right w:val="none" w:color="000000" w:sz="4" w:space="0"/>
         </w:tcBorders>
       </w:tcPr>
     </w:tblStylePr>
@@ -26267,9 +26407,9 @@
       </w:tcPr>
     </w:tblStylePr>
   </w:style>
-  <w:style w:type="table" w:styleId="112">
+  <w:style w:type="table" w:styleId="818">
     <w:name w:val="List Table 7 Colorful - Accent 2"/>
-    <w:basedOn w:val="665"/>
+    <w:basedOn w:val="904"/>
     <w:uiPriority w:val="99"/>
     <w:pPr>
       <w:pBdr/>
@@ -26368,11 +26508,11 @@
         <w:tblBorders/>
       </w:tblPr>
       <w:tcPr>
-        <w:shd w:color="ffffff"/>
+        <w:shd w:val="clear" w:color="ffffff"/>
         <w:tcBorders>
-          <w:top w:val="none"/>
-          <w:left w:val="none"/>
-          <w:bottom w:val="none"/>
+          <w:top w:val="none" w:color="000000" w:sz="4" w:space="0"/>
+          <w:left w:val="none" w:color="000000" w:sz="4" w:space="0"/>
+          <w:bottom w:val="none" w:color="000000" w:sz="4" w:space="0"/>
           <w:right w:val="single" w:color="000000" w:themeColor="accent2" w:themeTint="97" w:sz="4" w:space="0"/>
         </w:tcBorders>
       </w:tcPr>
@@ -26395,10 +26535,10 @@
       <w:tcPr>
         <w:shd w:val="clear" w:color="ffffff" w:themeColor="light1" w:fill="ffffff" w:themeFill="light1"/>
         <w:tcBorders>
-          <w:top w:val="none"/>
-          <w:left w:val="none"/>
+          <w:top w:val="none" w:color="000000" w:sz="4" w:space="0"/>
+          <w:left w:val="none" w:color="000000" w:sz="4" w:space="0"/>
           <w:bottom w:val="single" w:color="000000" w:themeColor="accent2" w:themeTint="97" w:sz="4" w:space="0"/>
-          <w:right w:val="none"/>
+          <w:right w:val="none" w:color="000000" w:sz="4" w:space="0"/>
         </w:tcBorders>
       </w:tcPr>
     </w:tblStylePr>
@@ -26418,12 +26558,12 @@
         <w:tblBorders/>
       </w:tblPr>
       <w:tcPr>
-        <w:shd w:color="ffffff"/>
+        <w:shd w:val="clear" w:color="ffffff"/>
         <w:tcBorders>
-          <w:top w:val="none"/>
+          <w:top w:val="none" w:color="000000" w:sz="4" w:space="0"/>
           <w:left w:val="single" w:color="000000" w:themeColor="accent2" w:themeTint="97" w:sz="4" w:space="0"/>
-          <w:bottom w:val="none"/>
-          <w:right w:val="none"/>
+          <w:bottom w:val="none" w:color="000000" w:sz="4" w:space="0"/>
+          <w:right w:val="none" w:color="000000" w:sz="4" w:space="0"/>
         </w:tcBorders>
       </w:tcPr>
     </w:tblStylePr>
@@ -26446,9 +26586,9 @@
         <w:shd w:val="clear" w:color="ffffff" w:themeColor="light1" w:fill="ffffff" w:themeFill="light1"/>
         <w:tcBorders>
           <w:top w:val="single" w:color="000000" w:themeColor="accent2" w:themeTint="97" w:sz="4" w:space="0"/>
-          <w:left w:val="none"/>
-          <w:bottom w:val="none"/>
-          <w:right w:val="none"/>
+          <w:left w:val="none" w:color="000000" w:sz="4" w:space="0"/>
+          <w:bottom w:val="none" w:color="000000" w:sz="4" w:space="0"/>
+          <w:right w:val="none" w:color="000000" w:sz="4" w:space="0"/>
         </w:tcBorders>
       </w:tcPr>
     </w:tblStylePr>
@@ -26523,9 +26663,9 @@
       </w:tcPr>
     </w:tblStylePr>
   </w:style>
-  <w:style w:type="table" w:styleId="113">
+  <w:style w:type="table" w:styleId="819">
     <w:name w:val="List Table 7 Colorful - Accent 3"/>
-    <w:basedOn w:val="665"/>
+    <w:basedOn w:val="904"/>
     <w:uiPriority w:val="99"/>
     <w:pPr>
       <w:pBdr/>
@@ -26624,11 +26764,11 @@
         <w:tblBorders/>
       </w:tblPr>
       <w:tcPr>
-        <w:shd w:color="ffffff"/>
+        <w:shd w:val="clear" w:color="ffffff"/>
         <w:tcBorders>
-          <w:top w:val="none"/>
-          <w:left w:val="none"/>
-          <w:bottom w:val="none"/>
+          <w:top w:val="none" w:color="000000" w:sz="4" w:space="0"/>
+          <w:left w:val="none" w:color="000000" w:sz="4" w:space="0"/>
+          <w:bottom w:val="none" w:color="000000" w:sz="4" w:space="0"/>
           <w:right w:val="single" w:color="000000" w:themeColor="accent3" w:themeTint="98" w:sz="4" w:space="0"/>
         </w:tcBorders>
       </w:tcPr>
@@ -26651,10 +26791,10 @@
       <w:tcPr>
         <w:shd w:val="clear" w:color="ffffff" w:themeColor="light1" w:fill="ffffff" w:themeFill="light1"/>
         <w:tcBorders>
-          <w:top w:val="none"/>
-          <w:left w:val="none"/>
+          <w:top w:val="none" w:color="000000" w:sz="4" w:space="0"/>
+          <w:left w:val="none" w:color="000000" w:sz="4" w:space="0"/>
           <w:bottom w:val="single" w:color="000000" w:themeColor="accent3" w:themeTint="98" w:sz="4" w:space="0"/>
-          <w:right w:val="none"/>
+          <w:right w:val="none" w:color="000000" w:sz="4" w:space="0"/>
         </w:tcBorders>
       </w:tcPr>
     </w:tblStylePr>
@@ -26674,12 +26814,12 @@
         <w:tblBorders/>
       </w:tblPr>
       <w:tcPr>
-        <w:shd w:color="ffffff"/>
+        <w:shd w:val="clear" w:color="ffffff"/>
         <w:tcBorders>
-          <w:top w:val="none"/>
+          <w:top w:val="none" w:color="000000" w:sz="4" w:space="0"/>
           <w:left w:val="single" w:color="000000" w:themeColor="accent3" w:themeTint="98" w:sz="4" w:space="0"/>
-          <w:bottom w:val="none"/>
-          <w:right w:val="none"/>
+          <w:bottom w:val="none" w:color="000000" w:sz="4" w:space="0"/>
+          <w:right w:val="none" w:color="000000" w:sz="4" w:space="0"/>
         </w:tcBorders>
       </w:tcPr>
     </w:tblStylePr>
@@ -26702,9 +26842,9 @@
         <w:shd w:val="clear" w:color="ffffff" w:themeColor="light1" w:fill="ffffff" w:themeFill="light1"/>
         <w:tcBorders>
           <w:top w:val="single" w:color="000000" w:themeColor="accent3" w:themeTint="98" w:sz="4" w:space="0"/>
-          <w:left w:val="none"/>
-          <w:bottom w:val="none"/>
-          <w:right w:val="none"/>
+          <w:left w:val="none" w:color="000000" w:sz="4" w:space="0"/>
+          <w:bottom w:val="none" w:color="000000" w:sz="4" w:space="0"/>
+          <w:right w:val="none" w:color="000000" w:sz="4" w:space="0"/>
         </w:tcBorders>
       </w:tcPr>
     </w:tblStylePr>
@@ -26779,9 +26919,9 @@
       </w:tcPr>
     </w:tblStylePr>
   </w:style>
-  <w:style w:type="table" w:styleId="114">
+  <w:style w:type="table" w:styleId="820">
     <w:name w:val="List Table 7 Colorful - Accent 4"/>
-    <w:basedOn w:val="665"/>
+    <w:basedOn w:val="904"/>
     <w:uiPriority w:val="99"/>
     <w:pPr>
       <w:pBdr/>
@@ -26880,11 +27020,11 @@
         <w:tblBorders/>
       </w:tblPr>
       <w:tcPr>
-        <w:shd w:color="ffffff"/>
+        <w:shd w:val="clear" w:color="ffffff"/>
         <w:tcBorders>
-          <w:top w:val="none"/>
-          <w:left w:val="none"/>
-          <w:bottom w:val="none"/>
+          <w:top w:val="none" w:color="000000" w:sz="4" w:space="0"/>
+          <w:left w:val="none" w:color="000000" w:sz="4" w:space="0"/>
+          <w:bottom w:val="none" w:color="000000" w:sz="4" w:space="0"/>
           <w:right w:val="single" w:color="000000" w:themeColor="accent4" w:themeTint="9A" w:sz="4" w:space="0"/>
         </w:tcBorders>
       </w:tcPr>
@@ -26907,10 +27047,10 @@
       <w:tcPr>
         <w:shd w:val="clear" w:color="ffffff" w:themeColor="light1" w:fill="ffffff" w:themeFill="light1"/>
         <w:tcBorders>
-          <w:top w:val="none"/>
-          <w:left w:val="none"/>
+          <w:top w:val="none" w:color="000000" w:sz="4" w:space="0"/>
+          <w:left w:val="none" w:color="000000" w:sz="4" w:space="0"/>
           <w:bottom w:val="single" w:color="000000" w:themeColor="accent4" w:themeTint="9A" w:sz="4" w:space="0"/>
-          <w:right w:val="none"/>
+          <w:right w:val="none" w:color="000000" w:sz="4" w:space="0"/>
         </w:tcBorders>
       </w:tcPr>
     </w:tblStylePr>
@@ -26930,12 +27070,12 @@
         <w:tblBorders/>
       </w:tblPr>
       <w:tcPr>
-        <w:shd w:color="ffffff"/>
+        <w:shd w:val="clear" w:color="ffffff"/>
         <w:tcBorders>
-          <w:top w:val="none"/>
+          <w:top w:val="none" w:color="000000" w:sz="4" w:space="0"/>
           <w:left w:val="single" w:color="000000" w:themeColor="accent4" w:themeTint="9A" w:sz="4" w:space="0"/>
-          <w:bottom w:val="none"/>
-          <w:right w:val="none"/>
+          <w:bottom w:val="none" w:color="000000" w:sz="4" w:space="0"/>
+          <w:right w:val="none" w:color="000000" w:sz="4" w:space="0"/>
         </w:tcBorders>
       </w:tcPr>
     </w:tblStylePr>
@@ -26958,9 +27098,9 @@
         <w:shd w:val="clear" w:color="ffffff" w:themeColor="light1" w:fill="ffffff" w:themeFill="light1"/>
         <w:tcBorders>
           <w:top w:val="single" w:color="000000" w:themeColor="accent4" w:themeTint="9A" w:sz="4" w:space="0"/>
-          <w:left w:val="none"/>
-          <w:bottom w:val="none"/>
-          <w:right w:val="none"/>
+          <w:left w:val="none" w:color="000000" w:sz="4" w:space="0"/>
+          <w:bottom w:val="none" w:color="000000" w:sz="4" w:space="0"/>
+          <w:right w:val="none" w:color="000000" w:sz="4" w:space="0"/>
         </w:tcBorders>
       </w:tcPr>
     </w:tblStylePr>
@@ -27035,9 +27175,9 @@
       </w:tcPr>
     </w:tblStylePr>
   </w:style>
-  <w:style w:type="table" w:styleId="115">
+  <w:style w:type="table" w:styleId="821">
     <w:name w:val="List Table 7 Colorful - Accent 5"/>
-    <w:basedOn w:val="665"/>
+    <w:basedOn w:val="904"/>
     <w:uiPriority w:val="99"/>
     <w:pPr>
       <w:pBdr/>
@@ -27136,11 +27276,11 @@
         <w:tblBorders/>
       </w:tblPr>
       <w:tcPr>
-        <w:shd w:color="ffffff"/>
+        <w:shd w:val="clear" w:color="ffffff"/>
         <w:tcBorders>
-          <w:top w:val="none"/>
-          <w:left w:val="none"/>
-          <w:bottom w:val="none"/>
+          <w:top w:val="none" w:color="000000" w:sz="4" w:space="0"/>
+          <w:left w:val="none" w:color="000000" w:sz="4" w:space="0"/>
+          <w:bottom w:val="none" w:color="000000" w:sz="4" w:space="0"/>
           <w:right w:val="single" w:color="000000" w:themeColor="accent5" w:themeTint="9A" w:sz="4" w:space="0"/>
         </w:tcBorders>
       </w:tcPr>
@@ -27163,10 +27303,10 @@
       <w:tcPr>
         <w:shd w:val="clear" w:color="ffffff" w:themeColor="light1" w:fill="ffffff" w:themeFill="light1"/>
         <w:tcBorders>
-          <w:top w:val="none"/>
-          <w:left w:val="none"/>
+          <w:top w:val="none" w:color="000000" w:sz="4" w:space="0"/>
+          <w:left w:val="none" w:color="000000" w:sz="4" w:space="0"/>
           <w:bottom w:val="single" w:color="000000" w:themeColor="accent5" w:themeTint="9A" w:sz="4" w:space="0"/>
-          <w:right w:val="none"/>
+          <w:right w:val="none" w:color="000000" w:sz="4" w:space="0"/>
         </w:tcBorders>
       </w:tcPr>
     </w:tblStylePr>
@@ -27186,12 +27326,12 @@
         <w:tblBorders/>
       </w:tblPr>
       <w:tcPr>
-        <w:shd w:color="ffffff"/>
+        <w:shd w:val="clear" w:color="ffffff"/>
         <w:tcBorders>
-          <w:top w:val="none"/>
+          <w:top w:val="none" w:color="000000" w:sz="4" w:space="0"/>
           <w:left w:val="single" w:color="000000" w:themeColor="accent5" w:themeTint="9A" w:sz="4" w:space="0"/>
-          <w:bottom w:val="none"/>
-          <w:right w:val="none"/>
+          <w:bottom w:val="none" w:color="000000" w:sz="4" w:space="0"/>
+          <w:right w:val="none" w:color="000000" w:sz="4" w:space="0"/>
         </w:tcBorders>
       </w:tcPr>
     </w:tblStylePr>
@@ -27214,9 +27354,9 @@
         <w:shd w:val="clear" w:color="ffffff" w:themeColor="light1" w:fill="ffffff" w:themeFill="light1"/>
         <w:tcBorders>
           <w:top w:val="single" w:color="000000" w:themeColor="accent5" w:themeTint="9A" w:sz="4" w:space="0"/>
-          <w:left w:val="none"/>
-          <w:bottom w:val="none"/>
-          <w:right w:val="none"/>
+          <w:left w:val="none" w:color="000000" w:sz="4" w:space="0"/>
+          <w:bottom w:val="none" w:color="000000" w:sz="4" w:space="0"/>
+          <w:right w:val="none" w:color="000000" w:sz="4" w:space="0"/>
         </w:tcBorders>
       </w:tcPr>
     </w:tblStylePr>
@@ -27291,9 +27431,9 @@
       </w:tcPr>
     </w:tblStylePr>
   </w:style>
-  <w:style w:type="table" w:styleId="116">
+  <w:style w:type="table" w:styleId="822">
     <w:name w:val="List Table 7 Colorful - Accent 6"/>
-    <w:basedOn w:val="665"/>
+    <w:basedOn w:val="904"/>
     <w:uiPriority w:val="99"/>
     <w:pPr>
       <w:pBdr/>
@@ -27392,11 +27532,11 @@
         <w:tblBorders/>
       </w:tblPr>
       <w:tcPr>
-        <w:shd w:color="ffffff"/>
+        <w:shd w:val="clear" w:color="ffffff"/>
         <w:tcBorders>
-          <w:top w:val="none"/>
-          <w:left w:val="none"/>
-          <w:bottom w:val="none"/>
+          <w:top w:val="none" w:color="000000" w:sz="4" w:space="0"/>
+          <w:left w:val="none" w:color="000000" w:sz="4" w:space="0"/>
+          <w:bottom w:val="none" w:color="000000" w:sz="4" w:space="0"/>
           <w:right w:val="single" w:color="000000" w:themeColor="accent6" w:themeTint="98" w:sz="4" w:space="0"/>
         </w:tcBorders>
       </w:tcPr>
@@ -27419,10 +27559,10 @@
       <w:tcPr>
         <w:shd w:val="clear" w:color="ffffff" w:themeColor="light1" w:fill="ffffff" w:themeFill="light1"/>
         <w:tcBorders>
-          <w:top w:val="none"/>
-          <w:left w:val="none"/>
+          <w:top w:val="none" w:color="000000" w:sz="4" w:space="0"/>
+          <w:left w:val="none" w:color="000000" w:sz="4" w:space="0"/>
           <w:bottom w:val="single" w:color="000000" w:themeColor="accent6" w:themeTint="98" w:sz="4" w:space="0"/>
-          <w:right w:val="none"/>
+          <w:right w:val="none" w:color="000000" w:sz="4" w:space="0"/>
         </w:tcBorders>
       </w:tcPr>
     </w:tblStylePr>
@@ -27442,12 +27582,12 @@
         <w:tblBorders/>
       </w:tblPr>
       <w:tcPr>
-        <w:shd w:color="ffffff"/>
+        <w:shd w:val="clear" w:color="ffffff"/>
         <w:tcBorders>
-          <w:top w:val="none"/>
+          <w:top w:val="none" w:color="000000" w:sz="4" w:space="0"/>
           <w:left w:val="single" w:color="000000" w:themeColor="accent6" w:themeTint="98" w:sz="4" w:space="0"/>
-          <w:bottom w:val="none"/>
-          <w:right w:val="none"/>
+          <w:bottom w:val="none" w:color="000000" w:sz="4" w:space="0"/>
+          <w:right w:val="none" w:color="000000" w:sz="4" w:space="0"/>
         </w:tcBorders>
       </w:tcPr>
     </w:tblStylePr>
@@ -27470,9 +27610,9 @@
         <w:shd w:val="clear" w:color="ffffff" w:themeColor="light1" w:fill="ffffff" w:themeFill="light1"/>
         <w:tcBorders>
           <w:top w:val="single" w:color="000000" w:themeColor="accent6" w:themeTint="98" w:sz="4" w:space="0"/>
-          <w:left w:val="none"/>
-          <w:bottom w:val="none"/>
-          <w:right w:val="none"/>
+          <w:left w:val="none" w:color="000000" w:sz="4" w:space="0"/>
+          <w:bottom w:val="none" w:color="000000" w:sz="4" w:space="0"/>
+          <w:right w:val="none" w:color="000000" w:sz="4" w:space="0"/>
         </w:tcBorders>
       </w:tcPr>
     </w:tblStylePr>
@@ -27547,9 +27687,9 @@
       </w:tcPr>
     </w:tblStylePr>
   </w:style>
-  <w:style w:type="table" w:styleId="117">
+  <w:style w:type="table" w:styleId="823">
     <w:name w:val="Lined - Accent"/>
-    <w:basedOn w:val="665"/>
+    <w:basedOn w:val="904"/>
     <w:uiPriority w:val="99"/>
     <w:pPr>
       <w:pBdr/>
@@ -27784,9 +27924,9 @@
       </w:tcPr>
     </w:tblStylePr>
   </w:style>
-  <w:style w:type="table" w:styleId="118">
+  <w:style w:type="table" w:styleId="824">
     <w:name w:val="Lined - Accent 1"/>
-    <w:basedOn w:val="665"/>
+    <w:basedOn w:val="904"/>
     <w:uiPriority w:val="99"/>
     <w:pPr>
       <w:pBdr/>
@@ -28021,9 +28161,9 @@
       </w:tcPr>
     </w:tblStylePr>
   </w:style>
-  <w:style w:type="table" w:styleId="119">
+  <w:style w:type="table" w:styleId="825">
     <w:name w:val="Lined - Accent 2"/>
-    <w:basedOn w:val="665"/>
+    <w:basedOn w:val="904"/>
     <w:uiPriority w:val="99"/>
     <w:pPr>
       <w:pBdr/>
@@ -28258,9 +28398,9 @@
       </w:tcPr>
     </w:tblStylePr>
   </w:style>
-  <w:style w:type="table" w:styleId="120">
+  <w:style w:type="table" w:styleId="826">
     <w:name w:val="Lined - Accent 3"/>
-    <w:basedOn w:val="665"/>
+    <w:basedOn w:val="904"/>
     <w:uiPriority w:val="99"/>
     <w:pPr>
       <w:pBdr/>
@@ -28495,9 +28635,9 @@
       </w:tcPr>
     </w:tblStylePr>
   </w:style>
-  <w:style w:type="table" w:styleId="121">
+  <w:style w:type="table" w:styleId="827">
     <w:name w:val="Lined - Accent 4"/>
-    <w:basedOn w:val="665"/>
+    <w:basedOn w:val="904"/>
     <w:uiPriority w:val="99"/>
     <w:pPr>
       <w:pBdr/>
@@ -28732,9 +28872,9 @@
       </w:tcPr>
     </w:tblStylePr>
   </w:style>
-  <w:style w:type="table" w:styleId="122">
+  <w:style w:type="table" w:styleId="828">
     <w:name w:val="Lined - Accent 5"/>
-    <w:basedOn w:val="665"/>
+    <w:basedOn w:val="904"/>
     <w:uiPriority w:val="99"/>
     <w:pPr>
       <w:pBdr/>
@@ -28969,9 +29109,9 @@
       </w:tcPr>
     </w:tblStylePr>
   </w:style>
-  <w:style w:type="table" w:styleId="123">
+  <w:style w:type="table" w:styleId="829">
     <w:name w:val="Lined - Accent 6"/>
-    <w:basedOn w:val="665"/>
+    <w:basedOn w:val="904"/>
     <w:uiPriority w:val="99"/>
     <w:pPr>
       <w:pBdr/>
@@ -29206,9 +29346,9 @@
       </w:tcPr>
     </w:tblStylePr>
   </w:style>
-  <w:style w:type="table" w:styleId="124">
+  <w:style w:type="table" w:styleId="830">
     <w:name w:val="Bordered &amp; Lined - Accent"/>
-    <w:basedOn w:val="665"/>
+    <w:basedOn w:val="904"/>
     <w:uiPriority w:val="99"/>
     <w:pPr>
       <w:pBdr/>
@@ -29450,9 +29590,9 @@
       </w:tcPr>
     </w:tblStylePr>
   </w:style>
-  <w:style w:type="table" w:styleId="125">
+  <w:style w:type="table" w:styleId="831">
     <w:name w:val="Bordered &amp; Lined - Accent 1"/>
-    <w:basedOn w:val="665"/>
+    <w:basedOn w:val="904"/>
     <w:uiPriority w:val="99"/>
     <w:pPr>
       <w:pBdr/>
@@ -29694,9 +29834,9 @@
       </w:tcPr>
     </w:tblStylePr>
   </w:style>
-  <w:style w:type="table" w:styleId="126">
+  <w:style w:type="table" w:styleId="832">
     <w:name w:val="Bordered &amp; Lined - Accent 2"/>
-    <w:basedOn w:val="665"/>
+    <w:basedOn w:val="904"/>
     <w:uiPriority w:val="99"/>
     <w:pPr>
       <w:pBdr/>
@@ -29938,9 +30078,9 @@
       </w:tcPr>
     </w:tblStylePr>
   </w:style>
-  <w:style w:type="table" w:styleId="127">
+  <w:style w:type="table" w:styleId="833">
     <w:name w:val="Bordered &amp; Lined - Accent 3"/>
-    <w:basedOn w:val="665"/>
+    <w:basedOn w:val="904"/>
     <w:uiPriority w:val="99"/>
     <w:pPr>
       <w:pBdr/>
@@ -30182,9 +30322,9 @@
       </w:tcPr>
     </w:tblStylePr>
   </w:style>
-  <w:style w:type="table" w:styleId="128">
+  <w:style w:type="table" w:styleId="834">
     <w:name w:val="Bordered &amp; Lined - Accent 4"/>
-    <w:basedOn w:val="665"/>
+    <w:basedOn w:val="904"/>
     <w:uiPriority w:val="99"/>
     <w:pPr>
       <w:pBdr/>
@@ -30426,9 +30566,9 @@
       </w:tcPr>
     </w:tblStylePr>
   </w:style>
-  <w:style w:type="table" w:styleId="129">
+  <w:style w:type="table" w:styleId="835">
     <w:name w:val="Bordered &amp; Lined - Accent 5"/>
-    <w:basedOn w:val="665"/>
+    <w:basedOn w:val="904"/>
     <w:uiPriority w:val="99"/>
     <w:pPr>
       <w:pBdr/>
@@ -30670,9 +30810,9 @@
       </w:tcPr>
     </w:tblStylePr>
   </w:style>
-  <w:style w:type="table" w:styleId="130">
+  <w:style w:type="table" w:styleId="836">
     <w:name w:val="Bordered &amp; Lined - Accent 6"/>
-    <w:basedOn w:val="665"/>
+    <w:basedOn w:val="904"/>
     <w:uiPriority w:val="99"/>
     <w:pPr>
       <w:pBdr/>
@@ -30914,9 +31054,9 @@
       </w:tcPr>
     </w:tblStylePr>
   </w:style>
-  <w:style w:type="table" w:styleId="131">
+  <w:style w:type="table" w:styleId="837">
     <w:name w:val="Bordered"/>
-    <w:basedOn w:val="665"/>
+    <w:basedOn w:val="904"/>
     <w:uiPriority w:val="99"/>
     <w:pPr>
       <w:pBdr/>
@@ -31145,9 +31285,9 @@
       </w:tcPr>
     </w:tblStylePr>
   </w:style>
-  <w:style w:type="table" w:styleId="132">
+  <w:style w:type="table" w:styleId="838">
     <w:name w:val="Bordered - Accent 1"/>
-    <w:basedOn w:val="665"/>
+    <w:basedOn w:val="904"/>
     <w:uiPriority w:val="99"/>
     <w:pPr>
       <w:pBdr/>
@@ -31376,9 +31516,9 @@
       </w:tcPr>
     </w:tblStylePr>
   </w:style>
-  <w:style w:type="table" w:styleId="133">
+  <w:style w:type="table" w:styleId="839">
     <w:name w:val="Bordered - Accent 2"/>
-    <w:basedOn w:val="665"/>
+    <w:basedOn w:val="904"/>
     <w:uiPriority w:val="99"/>
     <w:pPr>
       <w:pBdr/>
@@ -31607,9 +31747,9 @@
       </w:tcPr>
     </w:tblStylePr>
   </w:style>
-  <w:style w:type="table" w:styleId="134">
+  <w:style w:type="table" w:styleId="840">
     <w:name w:val="Bordered - Accent 3"/>
-    <w:basedOn w:val="665"/>
+    <w:basedOn w:val="904"/>
     <w:uiPriority w:val="99"/>
     <w:pPr>
       <w:pBdr/>
@@ -31838,9 +31978,9 @@
       </w:tcPr>
     </w:tblStylePr>
   </w:style>
-  <w:style w:type="table" w:styleId="135">
+  <w:style w:type="table" w:styleId="841">
     <w:name w:val="Bordered - Accent 4"/>
-    <w:basedOn w:val="665"/>
+    <w:basedOn w:val="904"/>
     <w:uiPriority w:val="99"/>
     <w:pPr>
       <w:pBdr/>
@@ -32069,9 +32209,9 @@
       </w:tcPr>
     </w:tblStylePr>
   </w:style>
-  <w:style w:type="table" w:styleId="136">
+  <w:style w:type="table" w:styleId="842">
     <w:name w:val="Bordered - Accent 5"/>
-    <w:basedOn w:val="665"/>
+    <w:basedOn w:val="904"/>
     <w:uiPriority w:val="99"/>
     <w:pPr>
       <w:pBdr/>
@@ -32300,9 +32440,9 @@
       </w:tcPr>
     </w:tblStylePr>
   </w:style>
-  <w:style w:type="table" w:styleId="137">
+  <w:style w:type="table" w:styleId="843">
     <w:name w:val="Bordered - Accent 6"/>
-    <w:basedOn w:val="665"/>
+    <w:basedOn w:val="904"/>
     <w:uiPriority w:val="99"/>
     <w:pPr>
       <w:pBdr/>
@@ -32531,11 +32671,11 @@
       </w:tcPr>
     </w:tblStylePr>
   </w:style>
-  <w:style w:type="paragraph" w:styleId="139">
+  <w:style w:type="paragraph" w:styleId="844">
     <w:name w:val="Heading 1"/>
-    <w:basedOn w:val="664"/>
-    <w:next w:val="664"/>
-    <w:link w:val="150"/>
+    <w:basedOn w:val="903"/>
+    <w:next w:val="903"/>
+    <w:link w:val="854"/>
     <w:uiPriority w:val="9"/>
     <w:qFormat/>
     <w:pPr>
@@ -32553,11 +32693,11 @@
       <w:szCs w:val="40"/>
     </w:rPr>
   </w:style>
-  <w:style w:type="paragraph" w:styleId="140">
+  <w:style w:type="paragraph" w:styleId="845">
     <w:name w:val="Heading 2"/>
-    <w:basedOn w:val="664"/>
-    <w:next w:val="664"/>
-    <w:link w:val="151"/>
+    <w:basedOn w:val="903"/>
+    <w:next w:val="903"/>
+    <w:link w:val="855"/>
     <w:uiPriority w:val="9"/>
     <w:unhideWhenUsed/>
     <w:qFormat/>
@@ -32576,11 +32716,11 @@
       <w:szCs w:val="32"/>
     </w:rPr>
   </w:style>
-  <w:style w:type="paragraph" w:styleId="141">
+  <w:style w:type="paragraph" w:styleId="846">
     <w:name w:val="Heading 3"/>
-    <w:basedOn w:val="664"/>
-    <w:next w:val="664"/>
-    <w:link w:val="152"/>
+    <w:basedOn w:val="903"/>
+    <w:next w:val="903"/>
+    <w:link w:val="856"/>
     <w:uiPriority w:val="9"/>
     <w:unhideWhenUsed/>
     <w:qFormat/>
@@ -32599,11 +32739,11 @@
       <w:szCs w:val="28"/>
     </w:rPr>
   </w:style>
-  <w:style w:type="paragraph" w:styleId="142">
+  <w:style w:type="paragraph" w:styleId="847">
     <w:name w:val="Heading 4"/>
-    <w:basedOn w:val="664"/>
-    <w:next w:val="664"/>
-    <w:link w:val="153"/>
+    <w:basedOn w:val="903"/>
+    <w:next w:val="903"/>
+    <w:link w:val="857"/>
     <w:uiPriority w:val="9"/>
     <w:unhideWhenUsed/>
     <w:qFormat/>
@@ -32622,11 +32762,11 @@
       <w:color w:val="0f4761" w:themeColor="accent1" w:themeShade="BF"/>
     </w:rPr>
   </w:style>
-  <w:style w:type="paragraph" w:styleId="143">
+  <w:style w:type="paragraph" w:styleId="848">
     <w:name w:val="Heading 5"/>
-    <w:basedOn w:val="664"/>
-    <w:next w:val="664"/>
-    <w:link w:val="154"/>
+    <w:basedOn w:val="903"/>
+    <w:next w:val="903"/>
+    <w:link w:val="858"/>
     <w:uiPriority w:val="9"/>
     <w:unhideWhenUsed/>
     <w:qFormat/>
@@ -32643,11 +32783,11 @@
       <w:color w:val="0f4761" w:themeColor="accent1" w:themeShade="BF"/>
     </w:rPr>
   </w:style>
-  <w:style w:type="paragraph" w:styleId="144">
+  <w:style w:type="paragraph" w:styleId="849">
     <w:name w:val="Heading 6"/>
-    <w:basedOn w:val="664"/>
-    <w:next w:val="664"/>
-    <w:link w:val="155"/>
+    <w:basedOn w:val="903"/>
+    <w:next w:val="903"/>
+    <w:link w:val="859"/>
     <w:uiPriority w:val="9"/>
     <w:unhideWhenUsed/>
     <w:qFormat/>
@@ -32666,11 +32806,11 @@
       <w:color w:val="595959" w:themeColor="text1" w:themeTint="A6"/>
     </w:rPr>
   </w:style>
-  <w:style w:type="paragraph" w:styleId="145">
+  <w:style w:type="paragraph" w:styleId="850">
     <w:name w:val="Heading 7"/>
-    <w:basedOn w:val="664"/>
-    <w:next w:val="664"/>
-    <w:link w:val="156"/>
+    <w:basedOn w:val="903"/>
+    <w:next w:val="903"/>
+    <w:link w:val="860"/>
     <w:uiPriority w:val="9"/>
     <w:unhideWhenUsed/>
     <w:qFormat/>
@@ -32687,11 +32827,11 @@
       <w:color w:val="595959" w:themeColor="text1" w:themeTint="A6"/>
     </w:rPr>
   </w:style>
-  <w:style w:type="paragraph" w:styleId="146">
+  <w:style w:type="paragraph" w:styleId="851">
     <w:name w:val="Heading 8"/>
-    <w:basedOn w:val="664"/>
-    <w:next w:val="664"/>
-    <w:link w:val="157"/>
+    <w:basedOn w:val="903"/>
+    <w:next w:val="903"/>
+    <w:link w:val="861"/>
     <w:uiPriority w:val="9"/>
     <w:unhideWhenUsed/>
     <w:qFormat/>
@@ -32710,11 +32850,11 @@
       <w:color w:val="272727" w:themeColor="text1" w:themeTint="D8"/>
     </w:rPr>
   </w:style>
-  <w:style w:type="paragraph" w:styleId="147">
+  <w:style w:type="paragraph" w:styleId="852">
     <w:name w:val="Heading 9"/>
-    <w:basedOn w:val="664"/>
-    <w:next w:val="664"/>
-    <w:link w:val="158"/>
+    <w:basedOn w:val="903"/>
+    <w:next w:val="903"/>
+    <w:link w:val="862"/>
     <w:uiPriority w:val="9"/>
     <w:unhideWhenUsed/>
     <w:qFormat/>
@@ -32733,7 +32873,7 @@
       <w:color w:val="272727" w:themeColor="text1" w:themeTint="D8"/>
     </w:rPr>
   </w:style>
-  <w:style w:type="character" w:styleId="148" w:default="1">
+  <w:style w:type="character" w:styleId="853" w:default="1">
     <w:name w:val="Default Paragraph Font"/>
     <w:uiPriority w:val="1"/>
     <w:semiHidden/>
@@ -32744,10 +32884,10 @@
       <w:ind/>
     </w:pPr>
   </w:style>
-  <w:style w:type="character" w:styleId="150">
+  <w:style w:type="character" w:styleId="854">
     <w:name w:val="Heading 1 Char"/>
-    <w:basedOn w:val="148"/>
-    <w:link w:val="139"/>
+    <w:basedOn w:val="853"/>
+    <w:link w:val="844"/>
     <w:uiPriority w:val="9"/>
     <w:pPr>
       <w:pBdr/>
@@ -32761,10 +32901,10 @@
       <w:szCs w:val="40"/>
     </w:rPr>
   </w:style>
-  <w:style w:type="character" w:styleId="151">
+  <w:style w:type="character" w:styleId="855">
     <w:name w:val="Heading 2 Char"/>
-    <w:basedOn w:val="148"/>
-    <w:link w:val="140"/>
+    <w:basedOn w:val="853"/>
+    <w:link w:val="845"/>
     <w:uiPriority w:val="9"/>
     <w:pPr>
       <w:pBdr/>
@@ -32778,10 +32918,10 @@
       <w:szCs w:val="32"/>
     </w:rPr>
   </w:style>
-  <w:style w:type="character" w:styleId="152">
+  <w:style w:type="character" w:styleId="856">
     <w:name w:val="Heading 3 Char"/>
-    <w:basedOn w:val="148"/>
-    <w:link w:val="141"/>
+    <w:basedOn w:val="853"/>
+    <w:link w:val="846"/>
     <w:uiPriority w:val="9"/>
     <w:pPr>
       <w:pBdr/>
@@ -32795,10 +32935,10 @@
       <w:szCs w:val="28"/>
     </w:rPr>
   </w:style>
-  <w:style w:type="character" w:styleId="153">
+  <w:style w:type="character" w:styleId="857">
     <w:name w:val="Heading 4 Char"/>
-    <w:basedOn w:val="148"/>
-    <w:link w:val="142"/>
+    <w:basedOn w:val="853"/>
+    <w:link w:val="847"/>
     <w:uiPriority w:val="9"/>
     <w:pPr>
       <w:pBdr/>
@@ -32812,10 +32952,10 @@
       <w:color w:val="0f4761" w:themeColor="accent1" w:themeShade="BF"/>
     </w:rPr>
   </w:style>
-  <w:style w:type="character" w:styleId="154">
+  <w:style w:type="character" w:styleId="858">
     <w:name w:val="Heading 5 Char"/>
-    <w:basedOn w:val="148"/>
-    <w:link w:val="143"/>
+    <w:basedOn w:val="853"/>
+    <w:link w:val="848"/>
     <w:uiPriority w:val="9"/>
     <w:pPr>
       <w:pBdr/>
@@ -32827,10 +32967,10 @@
       <w:color w:val="0f4761" w:themeColor="accent1" w:themeShade="BF"/>
     </w:rPr>
   </w:style>
-  <w:style w:type="character" w:styleId="155">
+  <w:style w:type="character" w:styleId="859">
     <w:name w:val="Heading 6 Char"/>
-    <w:basedOn w:val="148"/>
-    <w:link w:val="144"/>
+    <w:basedOn w:val="853"/>
+    <w:link w:val="849"/>
     <w:uiPriority w:val="9"/>
     <w:pPr>
       <w:pBdr/>
@@ -32844,10 +32984,10 @@
       <w:color w:val="595959" w:themeColor="text1" w:themeTint="A6"/>
     </w:rPr>
   </w:style>
-  <w:style w:type="character" w:styleId="156">
+  <w:style w:type="character" w:styleId="860">
     <w:name w:val="Heading 7 Char"/>
-    <w:basedOn w:val="148"/>
-    <w:link w:val="145"/>
+    <w:basedOn w:val="853"/>
+    <w:link w:val="850"/>
     <w:uiPriority w:val="9"/>
     <w:pPr>
       <w:pBdr/>
@@ -32859,10 +32999,10 @@
       <w:color w:val="595959" w:themeColor="text1" w:themeTint="A6"/>
     </w:rPr>
   </w:style>
-  <w:style w:type="character" w:styleId="157">
+  <w:style w:type="character" w:styleId="861">
     <w:name w:val="Heading 8 Char"/>
-    <w:basedOn w:val="148"/>
-    <w:link w:val="146"/>
+    <w:basedOn w:val="853"/>
+    <w:link w:val="851"/>
     <w:uiPriority w:val="9"/>
     <w:pPr>
       <w:pBdr/>
@@ -32876,10 +33016,10 @@
       <w:color w:val="272727" w:themeColor="text1" w:themeTint="D8"/>
     </w:rPr>
   </w:style>
-  <w:style w:type="character" w:styleId="158">
+  <w:style w:type="character" w:styleId="862">
     <w:name w:val="Heading 9 Char"/>
-    <w:basedOn w:val="148"/>
-    <w:link w:val="147"/>
+    <w:basedOn w:val="853"/>
+    <w:link w:val="852"/>
     <w:uiPriority w:val="9"/>
     <w:pPr>
       <w:pBdr/>
@@ -32893,11 +33033,11 @@
       <w:color w:val="272727" w:themeColor="text1" w:themeTint="D8"/>
     </w:rPr>
   </w:style>
-  <w:style w:type="paragraph" w:styleId="159">
+  <w:style w:type="paragraph" w:styleId="863">
     <w:name w:val="Title"/>
-    <w:basedOn w:val="664"/>
-    <w:next w:val="664"/>
-    <w:link w:val="160"/>
+    <w:basedOn w:val="903"/>
+    <w:next w:val="903"/>
+    <w:link w:val="864"/>
     <w:uiPriority w:val="10"/>
     <w:qFormat/>
     <w:pPr>
@@ -32913,10 +33053,10 @@
       <w:szCs w:val="56"/>
     </w:rPr>
   </w:style>
-  <w:style w:type="character" w:styleId="160">
+  <w:style w:type="character" w:styleId="864">
     <w:name w:val="Title Char"/>
-    <w:basedOn w:val="148"/>
-    <w:link w:val="159"/>
+    <w:basedOn w:val="853"/>
+    <w:link w:val="863"/>
     <w:uiPriority w:val="10"/>
     <w:pPr>
       <w:pBdr/>
@@ -32930,11 +33070,11 @@
       <w:szCs w:val="56"/>
     </w:rPr>
   </w:style>
-  <w:style w:type="paragraph" w:styleId="161">
+  <w:style w:type="paragraph" w:styleId="865">
     <w:name w:val="Subtitle"/>
-    <w:basedOn w:val="664"/>
-    <w:next w:val="664"/>
-    <w:link w:val="162"/>
+    <w:basedOn w:val="903"/>
+    <w:next w:val="903"/>
+    <w:link w:val="866"/>
     <w:uiPriority w:val="11"/>
     <w:qFormat/>
     <w:pPr>
@@ -32952,10 +33092,10 @@
       <w:szCs w:val="28"/>
     </w:rPr>
   </w:style>
-  <w:style w:type="character" w:styleId="162">
+  <w:style w:type="character" w:styleId="866">
     <w:name w:val="Subtitle Char"/>
-    <w:basedOn w:val="148"/>
-    <w:link w:val="161"/>
+    <w:basedOn w:val="853"/>
+    <w:link w:val="865"/>
     <w:uiPriority w:val="11"/>
     <w:pPr>
       <w:pBdr/>
@@ -32969,11 +33109,11 @@
       <w:szCs w:val="28"/>
     </w:rPr>
   </w:style>
-  <w:style w:type="paragraph" w:styleId="163">
+  <w:style w:type="paragraph" w:styleId="867">
     <w:name w:val="Quote"/>
-    <w:basedOn w:val="664"/>
-    <w:next w:val="664"/>
-    <w:link w:val="164"/>
+    <w:basedOn w:val="903"/>
+    <w:next w:val="903"/>
+    <w:link w:val="868"/>
     <w:uiPriority w:val="29"/>
     <w:qFormat/>
     <w:pPr>
@@ -32988,10 +33128,10 @@
       <w:color w:val="404040" w:themeColor="text1" w:themeTint="BF"/>
     </w:rPr>
   </w:style>
-  <w:style w:type="character" w:styleId="164">
+  <w:style w:type="character" w:styleId="868">
     <w:name w:val="Quote Char"/>
-    <w:basedOn w:val="148"/>
-    <w:link w:val="163"/>
+    <w:basedOn w:val="853"/>
+    <w:link w:val="867"/>
     <w:uiPriority w:val="29"/>
     <w:pPr>
       <w:pBdr/>
@@ -33004,9 +33144,9 @@
       <w:color w:val="404040" w:themeColor="text1" w:themeTint="BF"/>
     </w:rPr>
   </w:style>
-  <w:style w:type="character" w:styleId="166">
+  <w:style w:type="character" w:styleId="869">
     <w:name w:val="Intense Emphasis"/>
-    <w:basedOn w:val="148"/>
+    <w:basedOn w:val="853"/>
     <w:uiPriority w:val="21"/>
     <w:qFormat/>
     <w:pPr>
@@ -33020,11 +33160,11 @@
       <w:color w:val="0f4761" w:themeColor="accent1" w:themeShade="BF"/>
     </w:rPr>
   </w:style>
-  <w:style w:type="paragraph" w:styleId="167">
+  <w:style w:type="paragraph" w:styleId="870">
     <w:name w:val="Intense Quote"/>
-    <w:basedOn w:val="664"/>
-    <w:next w:val="664"/>
-    <w:link w:val="168"/>
+    <w:basedOn w:val="903"/>
+    <w:next w:val="903"/>
+    <w:link w:val="871"/>
     <w:uiPriority w:val="30"/>
     <w:qFormat/>
     <w:pPr>
@@ -33042,10 +33182,10 @@
       <w:color w:val="0f4761" w:themeColor="accent1" w:themeShade="BF"/>
     </w:rPr>
   </w:style>
-  <w:style w:type="character" w:styleId="168">
+  <w:style w:type="character" w:styleId="871">
     <w:name w:val="Intense Quote Char"/>
-    <w:basedOn w:val="148"/>
-    <w:link w:val="167"/>
+    <w:basedOn w:val="853"/>
+    <w:link w:val="870"/>
     <w:uiPriority w:val="30"/>
     <w:pPr>
       <w:pBdr/>
@@ -33058,9 +33198,9 @@
       <w:color w:val="0f4761" w:themeColor="accent1" w:themeShade="BF"/>
     </w:rPr>
   </w:style>
-  <w:style w:type="character" w:styleId="169">
+  <w:style w:type="character" w:styleId="872">
     <w:name w:val="Intense Reference"/>
-    <w:basedOn w:val="148"/>
+    <w:basedOn w:val="853"/>
     <w:uiPriority w:val="32"/>
     <w:qFormat/>
     <w:pPr>
@@ -33076,9 +33216,9 @@
       <w:spacing w:val="5"/>
     </w:rPr>
   </w:style>
-  <w:style w:type="character" w:styleId="171">
+  <w:style w:type="character" w:styleId="873">
     <w:name w:val="Subtle Emphasis"/>
-    <w:basedOn w:val="148"/>
+    <w:basedOn w:val="853"/>
     <w:uiPriority w:val="19"/>
     <w:qFormat/>
     <w:pPr>
@@ -33092,9 +33232,9 @@
       <w:color w:val="404040" w:themeColor="text1" w:themeTint="BF"/>
     </w:rPr>
   </w:style>
-  <w:style w:type="character" w:styleId="172">
+  <w:style w:type="character" w:styleId="874">
     <w:name w:val="Emphasis"/>
-    <w:basedOn w:val="148"/>
+    <w:basedOn w:val="853"/>
     <w:uiPriority w:val="20"/>
     <w:qFormat/>
     <w:pPr>
@@ -33107,9 +33247,9 @@
       <w:iCs/>
     </w:rPr>
   </w:style>
-  <w:style w:type="character" w:styleId="173">
+  <w:style w:type="character" w:styleId="875">
     <w:name w:val="Strong"/>
-    <w:basedOn w:val="148"/>
+    <w:basedOn w:val="853"/>
     <w:uiPriority w:val="22"/>
     <w:qFormat/>
     <w:pPr>
@@ -33122,9 +33262,9 @@
       <w:bCs/>
     </w:rPr>
   </w:style>
-  <w:style w:type="character" w:styleId="174">
+  <w:style w:type="character" w:styleId="876">
     <w:name w:val="Subtle Reference"/>
-    <w:basedOn w:val="148"/>
+    <w:basedOn w:val="853"/>
     <w:uiPriority w:val="31"/>
     <w:qFormat/>
     <w:pPr>
@@ -33137,9 +33277,9 @@
       <w:color w:val="5a5a5a" w:themeColor="text1" w:themeTint="A5"/>
     </w:rPr>
   </w:style>
-  <w:style w:type="character" w:styleId="175">
+  <w:style w:type="character" w:styleId="877">
     <w:name w:val="Book Title"/>
-    <w:basedOn w:val="148"/>
+    <w:basedOn w:val="853"/>
     <w:uiPriority w:val="33"/>
     <w:qFormat/>
     <w:pPr>
@@ -33155,10 +33295,10 @@
       <w:spacing w:val="5"/>
     </w:rPr>
   </w:style>
-  <w:style w:type="paragraph" w:styleId="176">
+  <w:style w:type="paragraph" w:styleId="878">
     <w:name w:val="Header"/>
-    <w:basedOn w:val="664"/>
-    <w:link w:val="177"/>
+    <w:basedOn w:val="903"/>
+    <w:link w:val="879"/>
     <w:uiPriority w:val="99"/>
     <w:unhideWhenUsed/>
     <w:pPr>
@@ -33171,10 +33311,10 @@
       <w:ind/>
     </w:pPr>
   </w:style>
-  <w:style w:type="character" w:styleId="177">
+  <w:style w:type="character" w:styleId="879">
     <w:name w:val="Header Char"/>
-    <w:basedOn w:val="148"/>
-    <w:link w:val="176"/>
+    <w:basedOn w:val="853"/>
+    <w:link w:val="878"/>
     <w:uiPriority w:val="99"/>
     <w:pPr>
       <w:pBdr/>
@@ -33182,10 +33322,10 @@
       <w:ind/>
     </w:pPr>
   </w:style>
-  <w:style w:type="paragraph" w:styleId="178">
+  <w:style w:type="paragraph" w:styleId="880">
     <w:name w:val="Footer"/>
-    <w:basedOn w:val="664"/>
-    <w:link w:val="179"/>
+    <w:basedOn w:val="903"/>
+    <w:link w:val="881"/>
     <w:uiPriority w:val="99"/>
     <w:unhideWhenUsed/>
     <w:pPr>
@@ -33198,10 +33338,10 @@
       <w:ind/>
     </w:pPr>
   </w:style>
-  <w:style w:type="character" w:styleId="179">
+  <w:style w:type="character" w:styleId="881">
     <w:name w:val="Footer Char"/>
-    <w:basedOn w:val="148"/>
-    <w:link w:val="178"/>
+    <w:basedOn w:val="853"/>
+    <w:link w:val="880"/>
     <w:uiPriority w:val="99"/>
     <w:pPr>
       <w:pBdr/>
@@ -33209,10 +33349,10 @@
       <w:ind/>
     </w:pPr>
   </w:style>
-  <w:style w:type="paragraph" w:styleId="180">
+  <w:style w:type="paragraph" w:styleId="882">
     <w:name w:val="Caption"/>
-    <w:basedOn w:val="664"/>
-    <w:next w:val="664"/>
+    <w:basedOn w:val="903"/>
+    <w:next w:val="903"/>
     <w:uiPriority w:val="35"/>
     <w:unhideWhenUsed/>
     <w:qFormat/>
@@ -33229,10 +33369,10 @@
       <w:szCs w:val="18"/>
     </w:rPr>
   </w:style>
-  <w:style w:type="paragraph" w:styleId="181">
+  <w:style w:type="paragraph" w:styleId="883">
     <w:name w:val="footnote text"/>
-    <w:basedOn w:val="664"/>
-    <w:link w:val="182"/>
+    <w:basedOn w:val="903"/>
+    <w:link w:val="884"/>
     <w:uiPriority w:val="99"/>
     <w:semiHidden/>
     <w:unhideWhenUsed/>
@@ -33246,10 +33386,10 @@
       <w:szCs w:val="20"/>
     </w:rPr>
   </w:style>
-  <w:style w:type="character" w:styleId="182">
+  <w:style w:type="character" w:styleId="884">
     <w:name w:val="Footnote Text Char"/>
-    <w:basedOn w:val="148"/>
-    <w:link w:val="181"/>
+    <w:basedOn w:val="853"/>
+    <w:link w:val="883"/>
     <w:uiPriority w:val="99"/>
     <w:semiHidden/>
     <w:pPr>
@@ -33262,9 +33402,9 @@
       <w:szCs w:val="20"/>
     </w:rPr>
   </w:style>
-  <w:style w:type="character" w:styleId="183">
+  <w:style w:type="character" w:styleId="885">
     <w:name w:val="footnote reference"/>
-    <w:basedOn w:val="148"/>
+    <w:basedOn w:val="853"/>
     <w:uiPriority w:val="99"/>
     <w:semiHidden/>
     <w:unhideWhenUsed/>
@@ -33277,10 +33417,10 @@
       <w:vertAlign w:val="superscript"/>
     </w:rPr>
   </w:style>
-  <w:style w:type="paragraph" w:styleId="184">
+  <w:style w:type="paragraph" w:styleId="886">
     <w:name w:val="endnote text"/>
-    <w:basedOn w:val="664"/>
-    <w:link w:val="185"/>
+    <w:basedOn w:val="903"/>
+    <w:link w:val="887"/>
     <w:uiPriority w:val="99"/>
     <w:semiHidden/>
     <w:unhideWhenUsed/>
@@ -33294,10 +33434,10 @@
       <w:szCs w:val="20"/>
     </w:rPr>
   </w:style>
-  <w:style w:type="character" w:styleId="185">
+  <w:style w:type="character" w:styleId="887">
     <w:name w:val="Endnote Text Char"/>
-    <w:basedOn w:val="148"/>
-    <w:link w:val="184"/>
+    <w:basedOn w:val="853"/>
+    <w:link w:val="886"/>
     <w:uiPriority w:val="99"/>
     <w:semiHidden/>
     <w:pPr>
@@ -33310,9 +33450,9 @@
       <w:szCs w:val="20"/>
     </w:rPr>
   </w:style>
-  <w:style w:type="character" w:styleId="186">
+  <w:style w:type="character" w:styleId="888">
     <w:name w:val="endnote reference"/>
-    <w:basedOn w:val="148"/>
+    <w:basedOn w:val="853"/>
     <w:uiPriority w:val="99"/>
     <w:semiHidden/>
     <w:unhideWhenUsed/>
@@ -33325,9 +33465,9 @@
       <w:vertAlign w:val="superscript"/>
     </w:rPr>
   </w:style>
-  <w:style w:type="character" w:styleId="187">
+  <w:style w:type="character" w:styleId="889">
     <w:name w:val="Hyperlink"/>
-    <w:basedOn w:val="148"/>
+    <w:basedOn w:val="853"/>
     <w:uiPriority w:val="99"/>
     <w:unhideWhenUsed/>
     <w:pPr>
@@ -33340,9 +33480,9 @@
       <w:u w:val="single"/>
     </w:rPr>
   </w:style>
-  <w:style w:type="character" w:styleId="188">
+  <w:style w:type="character" w:styleId="890">
     <w:name w:val="FollowedHyperlink"/>
-    <w:basedOn w:val="148"/>
+    <w:basedOn w:val="853"/>
     <w:uiPriority w:val="99"/>
     <w:semiHidden/>
     <w:unhideWhenUsed/>
@@ -33356,10 +33496,10 @@
       <w:u w:val="single"/>
     </w:rPr>
   </w:style>
-  <w:style w:type="paragraph" w:styleId="189">
+  <w:style w:type="paragraph" w:styleId="891">
     <w:name w:val="toc 1"/>
-    <w:basedOn w:val="664"/>
-    <w:next w:val="664"/>
+    <w:basedOn w:val="903"/>
+    <w:next w:val="903"/>
     <w:uiPriority w:val="39"/>
     <w:unhideWhenUsed/>
     <w:pPr>
@@ -33368,10 +33508,10 @@
       <w:ind/>
     </w:pPr>
   </w:style>
-  <w:style w:type="paragraph" w:styleId="190">
+  <w:style w:type="paragraph" w:styleId="892">
     <w:name w:val="toc 2"/>
-    <w:basedOn w:val="664"/>
-    <w:next w:val="664"/>
+    <w:basedOn w:val="903"/>
+    <w:next w:val="903"/>
     <w:uiPriority w:val="39"/>
     <w:unhideWhenUsed/>
     <w:pPr>
@@ -33380,10 +33520,10 @@
       <w:ind w:left="220"/>
     </w:pPr>
   </w:style>
-  <w:style w:type="paragraph" w:styleId="191">
+  <w:style w:type="paragraph" w:styleId="893">
     <w:name w:val="toc 3"/>
-    <w:basedOn w:val="664"/>
-    <w:next w:val="664"/>
+    <w:basedOn w:val="903"/>
+    <w:next w:val="903"/>
     <w:uiPriority w:val="39"/>
     <w:unhideWhenUsed/>
     <w:pPr>
@@ -33392,10 +33532,10 @@
       <w:ind w:left="440"/>
     </w:pPr>
   </w:style>
-  <w:style w:type="paragraph" w:styleId="192">
+  <w:style w:type="paragraph" w:styleId="894">
     <w:name w:val="toc 4"/>
-    <w:basedOn w:val="664"/>
-    <w:next w:val="664"/>
+    <w:basedOn w:val="903"/>
+    <w:next w:val="903"/>
     <w:uiPriority w:val="39"/>
     <w:unhideWhenUsed/>
     <w:pPr>
@@ -33404,10 +33544,10 @@
       <w:ind w:left="660"/>
     </w:pPr>
   </w:style>
-  <w:style w:type="paragraph" w:styleId="193">
+  <w:style w:type="paragraph" w:styleId="895">
     <w:name w:val="toc 5"/>
-    <w:basedOn w:val="664"/>
-    <w:next w:val="664"/>
+    <w:basedOn w:val="903"/>
+    <w:next w:val="903"/>
     <w:uiPriority w:val="39"/>
     <w:unhideWhenUsed/>
     <w:pPr>
@@ -33416,10 +33556,10 @@
       <w:ind w:left="880"/>
     </w:pPr>
   </w:style>
-  <w:style w:type="paragraph" w:styleId="194">
+  <w:style w:type="paragraph" w:styleId="896">
     <w:name w:val="toc 6"/>
-    <w:basedOn w:val="664"/>
-    <w:next w:val="664"/>
+    <w:basedOn w:val="903"/>
+    <w:next w:val="903"/>
     <w:uiPriority w:val="39"/>
     <w:unhideWhenUsed/>
     <w:pPr>
@@ -33428,10 +33568,10 @@
       <w:ind w:left="1100"/>
     </w:pPr>
   </w:style>
-  <w:style w:type="paragraph" w:styleId="195">
+  <w:style w:type="paragraph" w:styleId="897">
     <w:name w:val="toc 7"/>
-    <w:basedOn w:val="664"/>
-    <w:next w:val="664"/>
+    <w:basedOn w:val="903"/>
+    <w:next w:val="903"/>
     <w:uiPriority w:val="39"/>
     <w:unhideWhenUsed/>
     <w:pPr>
@@ -33440,10 +33580,10 @@
       <w:ind w:left="1320"/>
     </w:pPr>
   </w:style>
-  <w:style w:type="paragraph" w:styleId="196">
+  <w:style w:type="paragraph" w:styleId="898">
     <w:name w:val="toc 8"/>
-    <w:basedOn w:val="664"/>
-    <w:next w:val="664"/>
+    <w:basedOn w:val="903"/>
+    <w:next w:val="903"/>
     <w:uiPriority w:val="39"/>
     <w:unhideWhenUsed/>
     <w:pPr>
@@ -33452,10 +33592,10 @@
       <w:ind w:left="1540"/>
     </w:pPr>
   </w:style>
-  <w:style w:type="paragraph" w:styleId="197">
+  <w:style w:type="paragraph" w:styleId="899">
     <w:name w:val="toc 9"/>
-    <w:basedOn w:val="664"/>
-    <w:next w:val="664"/>
+    <w:basedOn w:val="903"/>
+    <w:next w:val="903"/>
     <w:uiPriority w:val="39"/>
     <w:unhideWhenUsed/>
     <w:pPr>
@@ -33464,9 +33604,9 @@
       <w:ind w:left="1760"/>
     </w:pPr>
   </w:style>
-  <w:style w:type="character" w:styleId="198">
+  <w:style w:type="character" w:styleId="900">
     <w:name w:val="Placeholder Text"/>
-    <w:basedOn w:val="148"/>
+    <w:basedOn w:val="853"/>
     <w:uiPriority w:val="99"/>
     <w:semiHidden/>
     <w:pPr>
@@ -33478,7 +33618,7 @@
       <w:color w:val="666666"/>
     </w:rPr>
   </w:style>
-  <w:style w:type="paragraph" w:styleId="208">
+  <w:style w:type="paragraph" w:styleId="901">
     <w:name w:val="TOC Heading"/>
     <w:uiPriority w:val="39"/>
     <w:unhideWhenUsed/>
@@ -33488,10 +33628,10 @@
       <w:ind/>
     </w:pPr>
   </w:style>
-  <w:style w:type="paragraph" w:styleId="209">
+  <w:style w:type="paragraph" w:styleId="902">
     <w:name w:val="table of figures"/>
-    <w:basedOn w:val="664"/>
-    <w:next w:val="664"/>
+    <w:basedOn w:val="903"/>
+    <w:next w:val="903"/>
     <w:uiPriority w:val="99"/>
     <w:unhideWhenUsed/>
     <w:pPr>
@@ -33500,7 +33640,7 @@
       <w:ind/>
     </w:pPr>
   </w:style>
-  <w:style w:type="paragraph" w:styleId="664" w:default="1">
+  <w:style w:type="paragraph" w:styleId="903" w:default="1">
     <w:name w:val="Normal"/>
     <w:qFormat/>
     <w:pPr>
@@ -33509,7 +33649,7 @@
       <w:ind/>
     </w:pPr>
   </w:style>
-  <w:style w:type="table" w:styleId="665" w:default="1">
+  <w:style w:type="table" w:styleId="904" w:default="1">
     <w:name w:val="Normal Table"/>
     <w:uiPriority w:val="99"/>
     <w:semiHidden/>
@@ -33702,7 +33842,7 @@
       </w:tcPr>
     </w:tblStylePr>
   </w:style>
-  <w:style w:type="numbering" w:styleId="666" w:default="1">
+  <w:style w:type="numbering" w:styleId="905" w:default="1">
     <w:name w:val="No List"/>
     <w:uiPriority w:val="99"/>
     <w:semiHidden/>
@@ -33713,9 +33853,9 @@
       <w:ind/>
     </w:pPr>
   </w:style>
-  <w:style w:type="paragraph" w:styleId="667">
+  <w:style w:type="paragraph" w:styleId="906">
     <w:name w:val="No Spacing"/>
-    <w:basedOn w:val="664"/>
+    <w:basedOn w:val="903"/>
     <w:uiPriority w:val="1"/>
     <w:qFormat/>
     <w:pPr>
@@ -33724,9 +33864,9 @@
       <w:ind/>
     </w:pPr>
   </w:style>
-  <w:style w:type="paragraph" w:styleId="668">
+  <w:style w:type="paragraph" w:styleId="907">
     <w:name w:val="List Paragraph"/>
-    <w:basedOn w:val="664"/>
+    <w:basedOn w:val="903"/>
     <w:uiPriority w:val="34"/>
     <w:qFormat/>
     <w:pPr>

</xml_diff>